<commit_message>
Update completed master's degree and current resume download
</commit_message>
<xml_diff>
--- a/docs/Hlay_Aliotte_Resume_Updated.docx
+++ b/docs/Hlay_Aliotte_Resume_Updated.docx
@@ -4,1082 +4,1320 @@
   <w:body>
     <w:p>
       <w:pPr>
-        <w:pStyle w:val="Title"/>
+        <w:spacing w:after="0" w:line="240" w:lineRule="auto"/>
+        <w:jc w:val="center"/>
+        <w:rPr>
+          <w:rFonts w:cs="Times New Roman"/>
+          <w:sz w:val="28"/>
+          <w:szCs w:val="28"/>
+        </w:rPr>
       </w:pPr>
       <w:r>
-        <w:t>Hlay Aliotte</w:t>
+        <w:rPr>
+          <w:rFonts w:cs="Times New Roman"/>
+          <w:b/>
+          <w:sz w:val="28"/>
+          <w:szCs w:val="28"/>
+        </w:rPr>
+        <w:t>HLAY ALIOTTE</w:t>
       </w:r>
     </w:p>
     <w:p>
+      <w:pPr>
+        <w:spacing w:after="80" w:line="240" w:lineRule="auto"/>
+        <w:jc w:val="center"/>
+        <w:rPr>
+          <w:rFonts w:cs="Times New Roman"/>
+          <w:sz w:val="24"/>
+          <w:szCs w:val="24"/>
+        </w:rPr>
+      </w:pPr>
       <w:r>
-        <w:t>Brookfield, IL</w:t>
+        <w:rPr>
+          <w:rFonts w:cs="Times New Roman"/>
+          <w:sz w:val="24"/>
+          <w:szCs w:val="24"/>
+        </w:rPr>
+        <w:t>312-369-0379  •  ashoobe@hotmail.com  •  Brookfield, IL</w:t>
       </w:r>
     </w:p>
     <w:p>
+      <w:pPr>
+        <w:spacing w:after="120"/>
+        <w:jc w:val="center"/>
+        <w:rPr>
+          <w:rFonts w:cs="Times New Roman"/>
+          <w:sz w:val="24"/>
+          <w:szCs w:val="24"/>
+        </w:rPr>
+      </w:pPr>
       <w:r>
-        <w:t xml:space="preserve">Email: </w:t>
+        <w:rPr>
+          <w:rFonts w:cs="Times New Roman"/>
+          <w:sz w:val="24"/>
+          <w:szCs w:val="24"/>
+        </w:rPr>
+        <w:t xml:space="preserve">LinkedIn: </w:t>
       </w:r>
       <w:hyperlink r:id="rId6">
         <w:r>
           <w:rPr>
-            <w:rStyle w:val="Hyperlink"/>
+            <w:rFonts w:cs="Times New Roman"/>
+            <w:sz w:val="24"/>
+            <w:szCs w:val="24"/>
           </w:rPr>
-          <w:t>ashoobe@hotmail.com</w:t>
+          <w:t>linkedin.com/in/hlay-aliotte-68abb077</w:t>
+        </w:r>
+      </w:hyperlink>
+      <w:r>
+        <w:rPr>
+          <w:rFonts w:cs="Times New Roman"/>
+          <w:sz w:val="24"/>
+          <w:szCs w:val="24"/>
+        </w:rPr>
+        <w:t xml:space="preserve">  •  Online Resume: </w:t>
+      </w:r>
+      <w:hyperlink r:id="rId7">
+        <w:r>
+          <w:rPr>
+            <w:rFonts w:cs="Times New Roman"/>
+            <w:sz w:val="24"/>
+            <w:szCs w:val="24"/>
+          </w:rPr>
+          <w:t>ashoobe.github.io/my-profile-website</w:t>
         </w:r>
       </w:hyperlink>
     </w:p>
     <w:p>
+      <w:pPr>
+        <w:pBdr>
+          <w:bottom w:val="single" w:sz="6" w:space="1" w:color="000000"/>
+        </w:pBdr>
+        <w:spacing w:before="80" w:after="20" w:line="240" w:lineRule="auto"/>
+        <w:rPr>
+          <w:rFonts w:cs="Times New Roman"/>
+          <w:sz w:val="26"/>
+          <w:szCs w:val="26"/>
+        </w:rPr>
+      </w:pPr>
       <w:r>
-        <w:t>Phone: 312-369-0379</w:t>
+        <w:rPr>
+          <w:rFonts w:cs="Times New Roman"/>
+          <w:b/>
+          <w:sz w:val="26"/>
+          <w:szCs w:val="26"/>
+        </w:rPr>
+        <w:t>SUMMARY OF QUALIFICATIONS</w:t>
       </w:r>
     </w:p>
     <w:p>
+      <w:pPr>
+        <w:pStyle w:val="ResumeBullet"/>
+        <w:rPr>
+          <w:rFonts w:cs="Times New Roman"/>
+          <w:sz w:val="24"/>
+          <w:szCs w:val="24"/>
+        </w:rPr>
+      </w:pPr>
       <w:r>
         <w:rPr>
-          <w:b/>
-          <w:bCs/>
-        </w:rPr>
-        <w:t>IT Administrator | Junior Web Developer | Cloud Computing Enthusiast</w:t>
+          <w:rFonts w:cs="Times New Roman"/>
+          <w:sz w:val="24"/>
+          <w:szCs w:val="24"/>
+        </w:rPr>
+        <w:t>• IT Administrator with hands-on experience supporting 70+ users, 8+ servers, and 45+ workstations in a public-sector technology environment.</w:t>
       </w:r>
     </w:p>
     <w:p>
       <w:pPr>
-        <w:pStyle w:val="Heading1"/>
+        <w:pStyle w:val="ResumeBullet"/>
+        <w:rPr>
+          <w:rFonts w:cs="Times New Roman"/>
+          <w:sz w:val="24"/>
+          <w:szCs w:val="24"/>
+        </w:rPr>
       </w:pPr>
       <w:r>
-        <w:t>Professional Summary</w:t>
+        <w:rPr>
+          <w:rFonts w:cs="Times New Roman"/>
+          <w:sz w:val="24"/>
+          <w:szCs w:val="24"/>
+        </w:rPr>
+        <w:t>• Master of Science in Computer Science graduate with Enterprise Cloud Computing concentration and full-stack capstone experience using React, Spring Boot, MongoDB, Redis, Kafka, and Docker.</w:t>
       </w:r>
     </w:p>
     <w:p>
+      <w:pPr>
+        <w:pStyle w:val="ResumeBullet"/>
+        <w:rPr>
+          <w:rFonts w:cs="Times New Roman"/>
+          <w:sz w:val="24"/>
+          <w:szCs w:val="24"/>
+        </w:rPr>
+      </w:pPr>
       <w:r>
-        <w:t xml:space="preserve">Resourceful IT Administrator and Junior Web Developer with a bachelor’s degree in Computer Science and currently pursuing a master’s in Enterprise Cloud Computing. Skilled in supporting enterprise IT systems, developing web applications, and managing cloud infrastructure. Adept at troubleshooting complex technical issues, optimizing system performance, and contributing to digital transformation initiatives. Passionate about learning emerging technologies and applying practical solutions that drive organizational success. </w:t>
+        <w:rPr>
+          <w:rFonts w:cs="Times New Roman"/>
+          <w:sz w:val="24"/>
+          <w:szCs w:val="24"/>
+        </w:rPr>
+        <w:t>• Skilled in Windows Server administration, Microsoft 365, Azure Active Directory, device support, backups, network security, website maintenance, and technical troubleshooting.</w:t>
       </w:r>
     </w:p>
     <w:p>
       <w:pPr>
-        <w:pStyle w:val="Heading1"/>
+        <w:pStyle w:val="ResumeBullet"/>
+        <w:rPr>
+          <w:rFonts w:cs="Times New Roman"/>
+          <w:sz w:val="24"/>
+          <w:szCs w:val="24"/>
+        </w:rPr>
       </w:pPr>
       <w:r>
-        <w:t>Education</w:t>
+        <w:rPr>
+          <w:rFonts w:cs="Times New Roman"/>
+          <w:sz w:val="24"/>
+          <w:szCs w:val="24"/>
+        </w:rPr>
+        <w:t>• Experienced building responsive web applications with JavaScript, React, Java, Python, Django, HTML, CSS, REST APIs, Firebase, and modern frontend frameworks.</w:t>
       </w:r>
     </w:p>
     <w:p>
       <w:pPr>
-        <w:pStyle w:val="ListParagraph"/>
-        <w:numPr>
-          <w:ilvl w:val="0"/>
-          <w:numId w:val="6"/>
-        </w:numPr>
-        <w:spacing w:after="0"/>
-        <w:rPr>
-          <w:b/>
-          <w:bCs/>
+        <w:pStyle w:val="ResumeBullet"/>
+        <w:rPr>
+          <w:rFonts w:cs="Times New Roman"/>
+          <w:sz w:val="24"/>
+          <w:szCs w:val="24"/>
         </w:rPr>
       </w:pPr>
       <w:r>
         <w:rPr>
-          <w:b/>
-          <w:bCs/>
-        </w:rPr>
-        <w:t>Master of Science in Enterprise Cloud Computing</w:t>
+          <w:rFonts w:cs="Times New Roman"/>
+          <w:sz w:val="24"/>
+          <w:szCs w:val="24"/>
+        </w:rPr>
+        <w:t>• Strong customer service, documentation, vendor coordination, staff training, and problem-resolution skills developed through IT administration and 10 years of hospitality leadership.</w:t>
       </w:r>
     </w:p>
     <w:p>
       <w:pPr>
-        <w:pStyle w:val="ListParagraph"/>
-        <w:numPr>
-          <w:ilvl w:val="0"/>
-          <w:numId w:val="6"/>
-        </w:numPr>
-        <w:spacing w:after="0"/>
+        <w:pStyle w:val="ResumeBullet"/>
+        <w:rPr>
+          <w:rFonts w:cs="Times New Roman"/>
+          <w:sz w:val="24"/>
+          <w:szCs w:val="24"/>
+        </w:rPr>
+      </w:pPr>
+    </w:p>
+    <w:p>
+      <w:pPr>
+        <w:pBdr>
+          <w:bottom w:val="single" w:sz="6" w:space="1" w:color="000000"/>
+        </w:pBdr>
+        <w:spacing w:before="80" w:after="20" w:line="240" w:lineRule="auto"/>
+        <w:rPr>
+          <w:rFonts w:cs="Times New Roman"/>
+          <w:b/>
+          <w:sz w:val="26"/>
+          <w:szCs w:val="26"/>
+        </w:rPr>
       </w:pPr>
       <w:r>
-        <w:t>Lewis University, Romeoville, IL</w:t>
+        <w:rPr>
+          <w:rFonts w:cs="Times New Roman"/>
+          <w:b/>
+          <w:sz w:val="26"/>
+          <w:szCs w:val="26"/>
+        </w:rPr>
+        <w:t>TECHNICAL SKILLS</w:t>
       </w:r>
     </w:p>
     <w:p>
       <w:pPr>
-        <w:pStyle w:val="ListParagraph"/>
-        <w:numPr>
-          <w:ilvl w:val="0"/>
-          <w:numId w:val="6"/>
-        </w:numPr>
-        <w:spacing w:after="0"/>
+        <w:spacing w:after="0" w:line="240" w:lineRule="auto"/>
+        <w:rPr>
+          <w:rFonts w:cs="Times New Roman"/>
+          <w:sz w:val="24"/>
+          <w:szCs w:val="24"/>
+        </w:rPr>
       </w:pPr>
       <w:r>
-        <w:t>Expected Graduation: 05/2026</w:t>
+        <w:rPr>
+          <w:rFonts w:cs="Times New Roman"/>
+          <w:b/>
+          <w:sz w:val="24"/>
+          <w:szCs w:val="24"/>
+        </w:rPr>
+        <w:t xml:space="preserve">OPERATING SYSTEMS: </w:t>
+      </w:r>
+      <w:r>
+        <w:rPr>
+          <w:rFonts w:cs="Times New Roman"/>
+          <w:sz w:val="24"/>
+          <w:szCs w:val="24"/>
+        </w:rPr>
+        <w:t>Windows 11/10, Windows Server 2022/2019/2016, macOS, Android, ChromeOS, Linux, VMware, VirtualBox</w:t>
       </w:r>
     </w:p>
     <w:p>
       <w:pPr>
-        <w:pStyle w:val="ListParagraph"/>
-        <w:numPr>
-          <w:ilvl w:val="0"/>
-          <w:numId w:val="6"/>
-        </w:numPr>
-        <w:spacing w:after="0"/>
-        <w:rPr>
+        <w:spacing w:after="0" w:line="240" w:lineRule="auto"/>
+        <w:rPr>
+          <w:rFonts w:cs="Times New Roman"/>
+          <w:sz w:val="24"/>
+          <w:szCs w:val="24"/>
+        </w:rPr>
+      </w:pPr>
+      <w:r>
+        <w:rPr>
+          <w:rFonts w:cs="Times New Roman"/>
           <w:b/>
-          <w:bCs/>
-        </w:rPr>
-      </w:pPr>
+          <w:sz w:val="24"/>
+          <w:szCs w:val="24"/>
+        </w:rPr>
+        <w:t xml:space="preserve">CLOUD/MICROSOFT: </w:t>
+      </w:r>
       <w:r>
         <w:rPr>
-          <w:b/>
-          <w:bCs/>
-        </w:rPr>
-        <w:t>Bachelor of Science in Computer Science</w:t>
+          <w:rFonts w:cs="Times New Roman"/>
+          <w:sz w:val="24"/>
+          <w:szCs w:val="24"/>
+        </w:rPr>
+        <w:t>Microsoft 365, Office 365, Azure Active Directory, Intune, SharePoint, OneDrive, Google Workspace</w:t>
       </w:r>
     </w:p>
     <w:p>
       <w:pPr>
-        <w:pStyle w:val="ListParagraph"/>
-        <w:numPr>
-          <w:ilvl w:val="0"/>
-          <w:numId w:val="6"/>
-        </w:numPr>
-        <w:spacing w:after="0"/>
+        <w:spacing w:after="0" w:line="240" w:lineRule="auto"/>
+        <w:rPr>
+          <w:rFonts w:cs="Times New Roman"/>
+          <w:sz w:val="24"/>
+          <w:szCs w:val="24"/>
+        </w:rPr>
       </w:pPr>
       <w:r>
-        <w:t>Lewis University, Romeoville, IL</w:t>
+        <w:rPr>
+          <w:rFonts w:cs="Times New Roman"/>
+          <w:b/>
+          <w:sz w:val="24"/>
+          <w:szCs w:val="24"/>
+        </w:rPr>
+        <w:t xml:space="preserve">NETWORK AND SYSTEM ADMINISTRATION: </w:t>
+      </w:r>
+      <w:r>
+        <w:rPr>
+          <w:rFonts w:cs="Times New Roman"/>
+          <w:sz w:val="24"/>
+          <w:szCs w:val="24"/>
+        </w:rPr>
+        <w:t>LAN/Wi-Fi troubleshooting, network security, backups, disaster recovery, printers, scanners, routers, switches, access points, phone systems</w:t>
       </w:r>
     </w:p>
     <w:p>
       <w:pPr>
-        <w:pStyle w:val="ListParagraph"/>
-        <w:numPr>
-          <w:ilvl w:val="0"/>
-          <w:numId w:val="6"/>
-        </w:numPr>
-        <w:spacing w:after="0"/>
+        <w:spacing w:after="0" w:line="240" w:lineRule="auto"/>
+        <w:rPr>
+          <w:rFonts w:cs="Times New Roman"/>
+          <w:sz w:val="24"/>
+          <w:szCs w:val="24"/>
+        </w:rPr>
       </w:pPr>
       <w:r>
-        <w:t>GPA: 3.7/4.0</w:t>
+        <w:rPr>
+          <w:rFonts w:cs="Times New Roman"/>
+          <w:b/>
+          <w:sz w:val="24"/>
+          <w:szCs w:val="24"/>
+        </w:rPr>
+        <w:t xml:space="preserve">PROGRAMMING AND WEB DEVELOPMENT: </w:t>
+      </w:r>
+      <w:r>
+        <w:rPr>
+          <w:rFonts w:cs="Times New Roman"/>
+          <w:sz w:val="24"/>
+          <w:szCs w:val="24"/>
+        </w:rPr>
+        <w:t>Java, Python, JavaScript, React, Vite, Node.js, Django, HTML5, CSS, Ajax, REST APIs</w:t>
       </w:r>
     </w:p>
     <w:p>
       <w:pPr>
-        <w:pStyle w:val="ListParagraph"/>
-        <w:numPr>
-          <w:ilvl w:val="0"/>
-          <w:numId w:val="6"/>
-        </w:numPr>
-        <w:spacing w:after="0"/>
+        <w:spacing w:after="0" w:line="240" w:lineRule="auto"/>
+        <w:rPr>
+          <w:rFonts w:cs="Times New Roman"/>
+          <w:sz w:val="24"/>
+          <w:szCs w:val="24"/>
+        </w:rPr>
       </w:pPr>
       <w:r>
-        <w:t>Relevant Courses: Programming Languages, Java OOP, Data Structures &amp; Algorithms, Operating Systems, Software Systems</w:t>
+        <w:rPr>
+          <w:rFonts w:cs="Times New Roman"/>
+          <w:b/>
+          <w:sz w:val="24"/>
+          <w:szCs w:val="24"/>
+        </w:rPr>
+        <w:t xml:space="preserve">DATABASES AND DEVELOPMENT TOOLS: </w:t>
+      </w:r>
+      <w:r>
+        <w:rPr>
+          <w:rFonts w:cs="Times New Roman"/>
+          <w:sz w:val="24"/>
+          <w:szCs w:val="24"/>
+        </w:rPr>
+        <w:t>MongoDB, Redis, Firebase, SQL basics, Pandas, NumPy, GitHub, Jira, Agile/Scrum, Docker Compose, Apache Kafka, OpenAPI/Swagger</w:t>
       </w:r>
     </w:p>
     <w:p>
       <w:pPr>
-        <w:pStyle w:val="ListParagraph"/>
-        <w:numPr>
-          <w:ilvl w:val="0"/>
-          <w:numId w:val="6"/>
-        </w:numPr>
-        <w:spacing w:after="0"/>
-        <w:rPr>
+        <w:spacing w:after="0" w:line="240" w:lineRule="auto"/>
+        <w:rPr>
+          <w:rFonts w:cs="Times New Roman"/>
+          <w:sz w:val="24"/>
+          <w:szCs w:val="24"/>
+        </w:rPr>
+      </w:pPr>
+      <w:r>
+        <w:rPr>
+          <w:rFonts w:cs="Times New Roman"/>
           <w:b/>
-          <w:bCs/>
-        </w:rPr>
-      </w:pPr>
+          <w:sz w:val="24"/>
+          <w:szCs w:val="24"/>
+        </w:rPr>
+        <w:t xml:space="preserve">DESIGN AND CONTENT TOOLS: </w:t>
+      </w:r>
       <w:r>
         <w:rPr>
-          <w:b/>
-          <w:bCs/>
-        </w:rPr>
-        <w:t>Associate of Applied Science in Computer Information Systems</w:t>
+          <w:rFonts w:cs="Times New Roman"/>
+          <w:sz w:val="24"/>
+          <w:szCs w:val="24"/>
+        </w:rPr>
+        <w:t>Drupal, WIX, Reach Media, Adobe Creative Suite, Tailwind CSS, Material UI</w:t>
       </w:r>
     </w:p>
     <w:p>
       <w:pPr>
-        <w:pStyle w:val="ListParagraph"/>
-        <w:numPr>
-          <w:ilvl w:val="0"/>
-          <w:numId w:val="6"/>
-        </w:numPr>
-        <w:spacing w:after="0"/>
+        <w:spacing w:after="0" w:line="240" w:lineRule="auto"/>
+        <w:rPr>
+          <w:rFonts w:cs="Times New Roman"/>
+          <w:sz w:val="24"/>
+          <w:szCs w:val="24"/>
+        </w:rPr>
+      </w:pPr>
+    </w:p>
+    <w:p>
+      <w:pPr>
+        <w:pBdr>
+          <w:bottom w:val="single" w:sz="6" w:space="1" w:color="000000"/>
+        </w:pBdr>
+        <w:spacing w:before="80" w:after="20" w:line="240" w:lineRule="auto"/>
+        <w:rPr>
+          <w:rFonts w:cs="Times New Roman"/>
+          <w:b/>
+          <w:sz w:val="26"/>
+          <w:szCs w:val="26"/>
+        </w:rPr>
       </w:pPr>
       <w:r>
-        <w:t>College of DuPage, Glen Ellyn, IL</w:t>
+        <w:rPr>
+          <w:rFonts w:cs="Times New Roman"/>
+          <w:b/>
+          <w:sz w:val="26"/>
+          <w:szCs w:val="26"/>
+        </w:rPr>
+        <w:t>EDUCATION</w:t>
       </w:r>
     </w:p>
     <w:p>
       <w:pPr>
-        <w:pStyle w:val="ListParagraph"/>
-        <w:numPr>
-          <w:ilvl w:val="0"/>
-          <w:numId w:val="6"/>
-        </w:numPr>
-        <w:spacing w:after="0"/>
+        <w:tabs>
+          <w:tab w:val="right" w:pos="10512"/>
+        </w:tabs>
+        <w:spacing w:before="40" w:after="0" w:line="240" w:lineRule="auto"/>
+        <w:rPr>
+          <w:rFonts w:cs="Times New Roman"/>
+          <w:sz w:val="24"/>
+          <w:szCs w:val="24"/>
+        </w:rPr>
       </w:pPr>
       <w:r>
-        <w:t>GPA: 3.5/4.0</w:t>
+        <w:rPr>
+          <w:rFonts w:cs="Times New Roman"/>
+          <w:b/>
+          <w:sz w:val="24"/>
+          <w:szCs w:val="24"/>
+        </w:rPr>
+        <w:t>Lewis University, Romeoville, IL</w:t>
+      </w:r>
+      <w:r>
+        <w:rPr>
+          <w:rFonts w:cs="Times New Roman"/>
+          <w:sz w:val="24"/>
+          <w:szCs w:val="24"/>
+        </w:rPr>
+        <w:tab/>
+        <w:t>May 2026</w:t>
       </w:r>
     </w:p>
     <w:p>
       <w:pPr>
-        <w:pStyle w:val="Heading1"/>
+        <w:spacing w:after="0" w:line="240" w:lineRule="auto"/>
+        <w:rPr>
+          <w:rFonts w:cs="Times New Roman"/>
+          <w:sz w:val="24"/>
+          <w:szCs w:val="24"/>
+        </w:rPr>
       </w:pPr>
       <w:r>
-        <w:t>Technical Skills</w:t>
+        <w:rPr>
+          <w:rFonts w:cs="Times New Roman"/>
+          <w:i/>
+          <w:sz w:val="24"/>
+          <w:szCs w:val="24"/>
+        </w:rPr>
+        <w:t>Master of Science in Computer Science, Concentration in Enterprise Cloud Computing</w:t>
+      </w:r>
+      <w:r>
+        <w:rPr>
+          <w:rFonts w:cs="Times New Roman"/>
+          <w:i/>
+          <w:sz w:val="24"/>
+          <w:szCs w:val="24"/>
+        </w:rPr>
+        <w:t xml:space="preserve"> GPA: 3.83</w:t>
+      </w:r>
+      <w:r>
+        <w:rPr>
+          <w:rFonts w:cs="Times New Roman"/>
+          <w:i/>
+          <w:sz w:val="24"/>
+          <w:szCs w:val="24"/>
+        </w:rPr>
+        <w:t>/4.00</w:t>
       </w:r>
     </w:p>
     <w:p>
       <w:pPr>
-        <w:pStyle w:val="ListParagraph"/>
-        <w:numPr>
-          <w:ilvl w:val="0"/>
-          <w:numId w:val="4"/>
-        </w:numPr>
-        <w:spacing w:after="0"/>
+        <w:tabs>
+          <w:tab w:val="right" w:pos="10512"/>
+        </w:tabs>
+        <w:spacing w:before="40" w:after="0" w:line="240" w:lineRule="auto"/>
+        <w:rPr>
+          <w:rFonts w:cs="Times New Roman"/>
+          <w:sz w:val="24"/>
+          <w:szCs w:val="24"/>
+        </w:rPr>
       </w:pPr>
       <w:r>
         <w:rPr>
+          <w:rFonts w:cs="Times New Roman"/>
           <w:b/>
-          <w:bCs/>
-        </w:rPr>
-        <w:t>Applications:</w:t>
+          <w:sz w:val="24"/>
+          <w:szCs w:val="24"/>
+        </w:rPr>
+        <w:t>Lewis University, Romeoville, IL</w:t>
       </w:r>
       <w:r>
-        <w:t xml:space="preserve"> Microsoft Office, Google Docs, Pandas, NumPy</w:t>
+        <w:rPr>
+          <w:rFonts w:cs="Times New Roman"/>
+          <w:sz w:val="24"/>
+          <w:szCs w:val="24"/>
+        </w:rPr>
+        <w:tab/>
+        <w:t>May 2023</w:t>
       </w:r>
     </w:p>
     <w:p>
       <w:pPr>
-        <w:pStyle w:val="ListParagraph"/>
-        <w:numPr>
-          <w:ilvl w:val="0"/>
-          <w:numId w:val="4"/>
-        </w:numPr>
-        <w:spacing w:after="0"/>
+        <w:spacing w:after="0" w:line="240" w:lineRule="auto"/>
+        <w:rPr>
+          <w:rFonts w:cs="Times New Roman"/>
+          <w:sz w:val="24"/>
+          <w:szCs w:val="24"/>
+        </w:rPr>
       </w:pPr>
       <w:r>
         <w:rPr>
-          <w:b/>
-          <w:bCs/>
-        </w:rPr>
-        <w:t>Web Technologies:</w:t>
-      </w:r>
-      <w:r>
-        <w:t xml:space="preserve"> HTML, HTML5, CSS, Ajax, JavaScript, Node.js, React.js</w:t>
+          <w:rFonts w:cs="Times New Roman"/>
+          <w:i/>
+          <w:sz w:val="24"/>
+          <w:szCs w:val="24"/>
+        </w:rPr>
+        <w:t>Bachelor of Science in Computer Science, GPA: 3.7/4.0</w:t>
       </w:r>
     </w:p>
     <w:p>
       <w:pPr>
-        <w:pStyle w:val="ListParagraph"/>
-        <w:numPr>
-          <w:ilvl w:val="0"/>
-          <w:numId w:val="4"/>
-        </w:numPr>
-        <w:spacing w:after="0"/>
+        <w:tabs>
+          <w:tab w:val="right" w:pos="10512"/>
+        </w:tabs>
+        <w:spacing w:before="40" w:after="0" w:line="240" w:lineRule="auto"/>
+        <w:rPr>
+          <w:rFonts w:cs="Times New Roman"/>
+          <w:sz w:val="24"/>
+          <w:szCs w:val="24"/>
+        </w:rPr>
       </w:pPr>
       <w:r>
         <w:rPr>
+          <w:rFonts w:cs="Times New Roman"/>
           <w:b/>
-          <w:bCs/>
-        </w:rPr>
-        <w:t>Programming Languages:</w:t>
+          <w:sz w:val="24"/>
+          <w:szCs w:val="24"/>
+        </w:rPr>
+        <w:t>College of DuPage, Glen Ellyn, IL</w:t>
       </w:r>
       <w:r>
-        <w:t xml:space="preserve"> Java, Python, JavaScript</w:t>
+        <w:rPr>
+          <w:rFonts w:cs="Times New Roman"/>
+          <w:sz w:val="24"/>
+          <w:szCs w:val="24"/>
+        </w:rPr>
+        <w:tab/>
+        <w:t>December 2021</w:t>
       </w:r>
     </w:p>
     <w:p>
       <w:pPr>
-        <w:pStyle w:val="ListParagraph"/>
-        <w:numPr>
-          <w:ilvl w:val="0"/>
-          <w:numId w:val="4"/>
-        </w:numPr>
-        <w:spacing w:after="0"/>
+        <w:spacing w:after="0" w:line="240" w:lineRule="auto"/>
+        <w:rPr>
+          <w:rFonts w:cs="Times New Roman"/>
+          <w:i/>
+          <w:sz w:val="24"/>
+          <w:szCs w:val="24"/>
+        </w:rPr>
       </w:pPr>
       <w:r>
         <w:rPr>
-          <w:b/>
-          <w:bCs/>
-        </w:rPr>
-        <w:t>Computer Maintenance:</w:t>
-      </w:r>
-      <w:r>
-        <w:t xml:space="preserve"> Troubleshooting, Upgrading, Software &amp; Hardware Installation</w:t>
+          <w:rFonts w:cs="Times New Roman"/>
+          <w:i/>
+          <w:sz w:val="24"/>
+          <w:szCs w:val="24"/>
+        </w:rPr>
+        <w:t>Associate of Applied Science in Computer Information Systems, GPA: 3.5/4.0</w:t>
       </w:r>
     </w:p>
     <w:p>
       <w:pPr>
-        <w:pStyle w:val="ListParagraph"/>
-        <w:numPr>
-          <w:ilvl w:val="0"/>
-          <w:numId w:val="4"/>
-        </w:numPr>
-        <w:spacing w:after="0"/>
+        <w:spacing w:after="0" w:line="240" w:lineRule="auto"/>
+        <w:rPr>
+          <w:rFonts w:cs="Times New Roman"/>
+          <w:sz w:val="24"/>
+          <w:szCs w:val="24"/>
+        </w:rPr>
+      </w:pPr>
+    </w:p>
+    <w:p>
+      <w:pPr>
+        <w:pBdr>
+          <w:bottom w:val="single" w:sz="6" w:space="1" w:color="000000"/>
+        </w:pBdr>
+        <w:spacing w:before="80" w:after="20" w:line="240" w:lineRule="auto"/>
+        <w:rPr>
+          <w:rFonts w:cs="Times New Roman"/>
+          <w:b/>
+          <w:sz w:val="26"/>
+          <w:szCs w:val="26"/>
+        </w:rPr>
       </w:pPr>
       <w:r>
         <w:rPr>
+          <w:rFonts w:cs="Times New Roman"/>
           <w:b/>
-          <w:bCs/>
-        </w:rPr>
-        <w:t>Operating Systems:</w:t>
+          <w:sz w:val="26"/>
+          <w:szCs w:val="26"/>
+        </w:rPr>
+        <w:t xml:space="preserve">WORK </w:t>
       </w:r>
       <w:r>
-        <w:t xml:space="preserve"> Windows, Windows Server, Android, ChromeOS, VirtualBox</w:t>
+        <w:rPr>
+          <w:rFonts w:cs="Times New Roman"/>
+          <w:b/>
+          <w:sz w:val="26"/>
+          <w:szCs w:val="26"/>
+        </w:rPr>
+        <w:t>EXPERIENCE</w:t>
       </w:r>
     </w:p>
     <w:p>
       <w:pPr>
-        <w:pStyle w:val="ListParagraph"/>
-        <w:numPr>
-          <w:ilvl w:val="0"/>
-          <w:numId w:val="4"/>
-        </w:numPr>
-        <w:spacing w:after="0"/>
+        <w:tabs>
+          <w:tab w:val="right" w:pos="10512"/>
+        </w:tabs>
+        <w:spacing w:before="40" w:after="0" w:line="240" w:lineRule="auto"/>
+        <w:rPr>
+          <w:rFonts w:cs="Times New Roman"/>
+          <w:sz w:val="24"/>
+          <w:szCs w:val="24"/>
+        </w:rPr>
       </w:pPr>
       <w:r>
         <w:rPr>
+          <w:rFonts w:cs="Times New Roman"/>
           <w:b/>
-          <w:bCs/>
-        </w:rPr>
-        <w:lastRenderedPageBreak/>
-        <w:t>Hardware/Systems:</w:t>
+          <w:sz w:val="24"/>
+          <w:szCs w:val="24"/>
+        </w:rPr>
+        <w:t>IT Administrator</w:t>
       </w:r>
       <w:r>
-        <w:t xml:space="preserve"> PC &amp; Apple Platforms, Printers, Scanners, Routers, Firewalls, Network Switches, Smartboards</w:t>
+        <w:rPr>
+          <w:rFonts w:cs="Times New Roman"/>
+          <w:sz w:val="24"/>
+          <w:szCs w:val="24"/>
+        </w:rPr>
+        <w:tab/>
+        <w:t>February 2024 - Present</w:t>
       </w:r>
     </w:p>
     <w:p>
       <w:pPr>
-        <w:pStyle w:val="ListParagraph"/>
-        <w:numPr>
-          <w:ilvl w:val="0"/>
-          <w:numId w:val="4"/>
-        </w:numPr>
-        <w:spacing w:after="0"/>
-        <w:rPr>
-          <w:lang w:val="fr-FR"/>
-        </w:rPr>
-      </w:pPr>
-      <w:proofErr w:type="spellStart"/>
+        <w:spacing w:after="0" w:line="240" w:lineRule="auto"/>
+        <w:rPr>
+          <w:rFonts w:cs="Times New Roman"/>
+          <w:sz w:val="24"/>
+          <w:szCs w:val="24"/>
+        </w:rPr>
+      </w:pPr>
       <w:r>
         <w:rPr>
-          <w:b/>
-          <w:bCs/>
-          <w:lang w:val="fr-FR"/>
-        </w:rPr>
-        <w:t>Telecommunications</w:t>
-      </w:r>
-      <w:proofErr w:type="spellEnd"/>
-      <w:r>
-        <w:rPr>
-          <w:b/>
-          <w:bCs/>
-          <w:lang w:val="fr-FR"/>
-        </w:rPr>
-        <w:t>:</w:t>
-      </w:r>
-      <w:r>
-        <w:rPr>
-          <w:lang w:val="fr-FR"/>
-        </w:rPr>
-        <w:t xml:space="preserve"> Phone </w:t>
-      </w:r>
-      <w:proofErr w:type="spellStart"/>
-      <w:r>
-        <w:rPr>
-          <w:lang w:val="fr-FR"/>
-        </w:rPr>
-        <w:t>Systems</w:t>
-      </w:r>
-      <w:proofErr w:type="spellEnd"/>
-      <w:r>
-        <w:rPr>
-          <w:lang w:val="fr-FR"/>
-        </w:rPr>
-        <w:t>, Mobile Communications, Wi-Fi Access Points, Copier/Fax Maintenance</w:t>
-      </w:r>
-    </w:p>
-    <w:p>
-      <w:pPr>
-        <w:pStyle w:val="ListParagraph"/>
-        <w:numPr>
-          <w:ilvl w:val="0"/>
-          <w:numId w:val="4"/>
-        </w:numPr>
-        <w:spacing w:after="0"/>
-      </w:pPr>
-      <w:r>
-        <w:rPr>
-          <w:b/>
-          <w:bCs/>
-        </w:rPr>
-        <w:t>Network Administration:</w:t>
-      </w:r>
-      <w:r>
-        <w:t xml:space="preserve"> Windows Server 2022/2019/2016, Azure Active Directory, Network Security, Backup Management</w:t>
-      </w:r>
-    </w:p>
-    <w:p>
-      <w:pPr>
-        <w:pStyle w:val="ListParagraph"/>
-        <w:numPr>
-          <w:ilvl w:val="0"/>
-          <w:numId w:val="4"/>
-        </w:numPr>
-        <w:spacing w:after="0"/>
-      </w:pPr>
-      <w:r>
-        <w:rPr>
-          <w:b/>
-          <w:bCs/>
-        </w:rPr>
-        <w:t>Cloud Technologies:</w:t>
-      </w:r>
-      <w:r>
-        <w:t xml:space="preserve"> Azure, Office 365</w:t>
-      </w:r>
-    </w:p>
-    <w:p>
-      <w:pPr>
-        <w:pStyle w:val="ListParagraph"/>
-        <w:numPr>
-          <w:ilvl w:val="0"/>
-          <w:numId w:val="4"/>
-        </w:numPr>
-        <w:spacing w:after="0"/>
-      </w:pPr>
-      <w:r>
-        <w:rPr>
-          <w:b/>
-          <w:bCs/>
-        </w:rPr>
-        <w:t>Project Management:</w:t>
-      </w:r>
-      <w:r>
-        <w:t xml:space="preserve"> Agile, Scrum, Jira</w:t>
-      </w:r>
-    </w:p>
-    <w:p>
-      <w:pPr>
-        <w:pStyle w:val="Heading1"/>
-      </w:pPr>
-      <w:r>
-        <w:t>Language Skills</w:t>
-      </w:r>
-    </w:p>
-    <w:p>
-      <w:pPr>
-        <w:pStyle w:val="ListParagraph"/>
-        <w:numPr>
-          <w:ilvl w:val="0"/>
-          <w:numId w:val="3"/>
-        </w:numPr>
-        <w:spacing w:after="0"/>
-      </w:pPr>
-      <w:r>
-        <w:t>English</w:t>
-      </w:r>
-    </w:p>
-    <w:p>
-      <w:pPr>
-        <w:pStyle w:val="ListParagraph"/>
-        <w:numPr>
-          <w:ilvl w:val="0"/>
-          <w:numId w:val="3"/>
-        </w:numPr>
-        <w:spacing w:after="0"/>
-      </w:pPr>
-      <w:r>
-        <w:t>French</w:t>
-      </w:r>
-    </w:p>
-    <w:p>
-      <w:pPr>
-        <w:pStyle w:val="ListParagraph"/>
-        <w:numPr>
-          <w:ilvl w:val="0"/>
-          <w:numId w:val="3"/>
-        </w:numPr>
-        <w:spacing w:after="0"/>
-      </w:pPr>
-      <w:r>
-        <w:t>Creole</w:t>
-      </w:r>
-    </w:p>
-    <w:p>
-      <w:pPr>
-        <w:pStyle w:val="ListParagraph"/>
-        <w:numPr>
-          <w:ilvl w:val="0"/>
-          <w:numId w:val="3"/>
-        </w:numPr>
-        <w:spacing w:after="0"/>
-      </w:pPr>
-      <w:r>
-        <w:t>Spanish</w:t>
-      </w:r>
-    </w:p>
-    <w:p>
-      <w:pPr>
-        <w:pStyle w:val="ListParagraph"/>
-        <w:spacing w:after="0"/>
-      </w:pPr>
-    </w:p>
-    <w:p>
-      <w:pPr>
-        <w:pStyle w:val="Heading1"/>
-      </w:pPr>
-      <w:r>
-        <w:t>Professional Experience</w:t>
-      </w:r>
-    </w:p>
-    <w:p>
-      <w:pPr>
-        <w:pStyle w:val="ListParagraph"/>
-        <w:numPr>
-          <w:ilvl w:val="0"/>
-          <w:numId w:val="2"/>
-        </w:numPr>
-        <w:spacing w:after="0"/>
-        <w:rPr>
-          <w:b/>
-          <w:bCs/>
-        </w:rPr>
-      </w:pPr>
-      <w:r>
-        <w:rPr>
-          <w:b/>
-          <w:bCs/>
-        </w:rPr>
-        <w:t>IT Administrator</w:t>
-      </w:r>
-    </w:p>
-    <w:p>
-      <w:pPr>
-        <w:pStyle w:val="ListParagraph"/>
-        <w:numPr>
-          <w:ilvl w:val="0"/>
-          <w:numId w:val="2"/>
-        </w:numPr>
-        <w:spacing w:after="0"/>
-      </w:pPr>
-      <w:r>
+          <w:rFonts w:cs="Times New Roman"/>
+          <w:i/>
+          <w:sz w:val="24"/>
+          <w:szCs w:val="24"/>
+        </w:rPr>
         <w:t>Oak Brook Park District, Oak Brook, IL</w:t>
       </w:r>
     </w:p>
     <w:p>
       <w:pPr>
-        <w:pStyle w:val="ListParagraph"/>
-        <w:numPr>
-          <w:ilvl w:val="0"/>
-          <w:numId w:val="2"/>
-        </w:numPr>
-        <w:spacing w:after="0"/>
+        <w:pStyle w:val="ResumeBullet"/>
+        <w:rPr>
+          <w:rFonts w:cs="Times New Roman"/>
+          <w:sz w:val="24"/>
+          <w:szCs w:val="24"/>
+        </w:rPr>
       </w:pPr>
       <w:r>
-        <w:t>02/2024 – Present</w:t>
+        <w:rPr>
+          <w:rFonts w:cs="Times New Roman"/>
+          <w:sz w:val="24"/>
+          <w:szCs w:val="24"/>
+        </w:rPr>
+        <w:t>• Support 70+ users, 8+ servers, and 45+ workstations by resolving hardware, software, account, network, and application issues.</w:t>
       </w:r>
     </w:p>
     <w:p>
       <w:pPr>
-        <w:pStyle w:val="ListParagraph"/>
-        <w:numPr>
-          <w:ilvl w:val="1"/>
-          <w:numId w:val="2"/>
-        </w:numPr>
-        <w:spacing w:after="0"/>
+        <w:pStyle w:val="ResumeBullet"/>
+        <w:rPr>
+          <w:rFonts w:cs="Times New Roman"/>
+          <w:sz w:val="24"/>
+          <w:szCs w:val="24"/>
+        </w:rPr>
       </w:pPr>
       <w:r>
-        <w:t>Provide IT support to over 70 users, managing more than 8 servers and 45 workstations.</w:t>
+        <w:rPr>
+          <w:rFonts w:cs="Times New Roman"/>
+          <w:sz w:val="24"/>
+          <w:szCs w:val="24"/>
+        </w:rPr>
+        <w:t>• Administer Windows Server, Microsoft 365, Office 365, Azure Active Directory, email services, backups, and network security controls.</w:t>
       </w:r>
     </w:p>
     <w:p>
       <w:pPr>
-        <w:pStyle w:val="ListParagraph"/>
-        <w:numPr>
-          <w:ilvl w:val="1"/>
-          <w:numId w:val="2"/>
-        </w:numPr>
-        <w:spacing w:after="0"/>
+        <w:pStyle w:val="ResumeBullet"/>
+        <w:rPr>
+          <w:rFonts w:cs="Times New Roman"/>
+          <w:sz w:val="24"/>
+          <w:szCs w:val="24"/>
+        </w:rPr>
       </w:pPr>
       <w:r>
-        <w:t>Administer and troubleshoot Windows Server environments, Office 365, and Azure Active Directory.</w:t>
+        <w:rPr>
+          <w:rFonts w:cs="Times New Roman"/>
+          <w:sz w:val="24"/>
+          <w:szCs w:val="24"/>
+        </w:rPr>
+        <w:t>• Install, configure, and maintain PCs, Apple devices, printers, scanners, smartboards, phones, Wi-Fi equipment, kiosks, and display systems.</w:t>
       </w:r>
     </w:p>
     <w:p>
       <w:pPr>
-        <w:pStyle w:val="ListParagraph"/>
-        <w:numPr>
-          <w:ilvl w:val="1"/>
-          <w:numId w:val="2"/>
-        </w:numPr>
-        <w:spacing w:after="0"/>
+        <w:pStyle w:val="ResumeBullet"/>
+        <w:rPr>
+          <w:rFonts w:cs="Times New Roman"/>
+          <w:sz w:val="24"/>
+          <w:szCs w:val="24"/>
+        </w:rPr>
       </w:pPr>
       <w:r>
-        <w:t>Manage backups, network security, email services, and disaster recovery.</w:t>
+        <w:rPr>
+          <w:rFonts w:cs="Times New Roman"/>
+          <w:sz w:val="24"/>
+          <w:szCs w:val="24"/>
+        </w:rPr>
+        <w:t>• Manage user onboarding, IT orientation, access changes, documentation, and staff training to improve consistency and reduce repeat issues.</w:t>
       </w:r>
     </w:p>
     <w:p>
       <w:pPr>
-        <w:pStyle w:val="ListParagraph"/>
-        <w:numPr>
-          <w:ilvl w:val="1"/>
-          <w:numId w:val="2"/>
-        </w:numPr>
-        <w:spacing w:after="0"/>
+        <w:pStyle w:val="ResumeBullet"/>
+        <w:rPr>
+          <w:rFonts w:cs="Times New Roman"/>
+          <w:sz w:val="24"/>
+          <w:szCs w:val="24"/>
+        </w:rPr>
       </w:pPr>
       <w:r>
-        <w:t>Install, support, and maintain hardware, software, and peripherals on PC and Apple platforms.</w:t>
+        <w:rPr>
+          <w:rFonts w:cs="Times New Roman"/>
+          <w:sz w:val="24"/>
+          <w:szCs w:val="24"/>
+        </w:rPr>
+        <w:lastRenderedPageBreak/>
+        <w:t>• Maintain district website content, online forms, surveys, kiosk displays, and digital communications in partnership with staff and vendors.</w:t>
       </w:r>
     </w:p>
     <w:p>
       <w:pPr>
-        <w:pStyle w:val="ListParagraph"/>
-        <w:numPr>
-          <w:ilvl w:val="1"/>
-          <w:numId w:val="2"/>
-        </w:numPr>
-        <w:spacing w:after="0"/>
+        <w:pStyle w:val="ResumeBullet"/>
+        <w:rPr>
+          <w:rFonts w:cs="Times New Roman"/>
+          <w:sz w:val="24"/>
+          <w:szCs w:val="24"/>
+        </w:rPr>
       </w:pPr>
       <w:r>
-        <w:t>Develop and implement IT policies, procedures, and guidelines.</w:t>
+        <w:rPr>
+          <w:rFonts w:cs="Times New Roman"/>
+          <w:sz w:val="24"/>
+          <w:szCs w:val="24"/>
+        </w:rPr>
+        <w:t>• Coordinate with consultants and vendors on infrastructure upgrades, procurement, budgeting, cybersecurity, and disaster-recovery planning.</w:t>
       </w:r>
     </w:p>
     <w:p>
       <w:pPr>
-        <w:pStyle w:val="ListParagraph"/>
-        <w:numPr>
-          <w:ilvl w:val="1"/>
-          <w:numId w:val="2"/>
-        </w:numPr>
-        <w:spacing w:after="0"/>
+        <w:tabs>
+          <w:tab w:val="right" w:pos="10512"/>
+        </w:tabs>
+        <w:spacing w:before="40" w:after="0" w:line="240" w:lineRule="auto"/>
+        <w:rPr>
+          <w:rFonts w:cs="Times New Roman"/>
+          <w:sz w:val="24"/>
+          <w:szCs w:val="24"/>
+        </w:rPr>
       </w:pPr>
       <w:r>
-        <w:t>Lead the design and maintenance of district website, kiosks, and online surveys.</w:t>
+        <w:rPr>
+          <w:rFonts w:cs="Times New Roman"/>
+          <w:b/>
+          <w:sz w:val="24"/>
+          <w:szCs w:val="24"/>
+        </w:rPr>
+        <w:t>Customer Service, Front Desk Supervisor</w:t>
+      </w:r>
+      <w:r>
+        <w:rPr>
+          <w:rFonts w:cs="Times New Roman"/>
+          <w:sz w:val="24"/>
+          <w:szCs w:val="24"/>
+        </w:rPr>
+        <w:tab/>
+        <w:t>August 2014 - February 2024</w:t>
       </w:r>
     </w:p>
     <w:p>
       <w:pPr>
-        <w:pStyle w:val="ListParagraph"/>
-        <w:numPr>
-          <w:ilvl w:val="1"/>
-          <w:numId w:val="2"/>
-        </w:numPr>
-        <w:spacing w:after="0"/>
+        <w:spacing w:after="0" w:line="240" w:lineRule="auto"/>
+        <w:rPr>
+          <w:rFonts w:cs="Times New Roman"/>
+          <w:sz w:val="24"/>
+          <w:szCs w:val="24"/>
+        </w:rPr>
       </w:pPr>
       <w:r>
-        <w:t>Collaborate with IT consultants and vendors on projects and infrastructure upgrades.</w:t>
-      </w:r>
-    </w:p>
-    <w:p>
-      <w:pPr>
-        <w:pStyle w:val="ListParagraph"/>
-        <w:numPr>
-          <w:ilvl w:val="1"/>
-          <w:numId w:val="2"/>
-        </w:numPr>
-        <w:spacing w:after="0"/>
-      </w:pPr>
-      <w:r>
-        <w:t>Troubleshoot communication systems, including phones, mobile, and Wi-Fi.</w:t>
-      </w:r>
-    </w:p>
-    <w:p>
-      <w:pPr>
-        <w:pStyle w:val="ListParagraph"/>
-        <w:numPr>
-          <w:ilvl w:val="1"/>
-          <w:numId w:val="2"/>
-        </w:numPr>
-        <w:spacing w:after="0"/>
-      </w:pPr>
-      <w:r>
-        <w:t>Conduct IT orientation and provide ongoing support and training to staff.</w:t>
-      </w:r>
-    </w:p>
-    <w:p>
-      <w:pPr>
-        <w:pStyle w:val="ListParagraph"/>
-        <w:numPr>
-          <w:ilvl w:val="1"/>
-          <w:numId w:val="2"/>
-        </w:numPr>
-        <w:spacing w:after="0"/>
-      </w:pPr>
-      <w:r>
-        <w:t>Assist with IT budgeting, procurement, and financial management.</w:t>
-      </w:r>
-    </w:p>
-    <w:p>
-      <w:pPr>
-        <w:pStyle w:val="ListParagraph"/>
-        <w:numPr>
-          <w:ilvl w:val="1"/>
-          <w:numId w:val="2"/>
-        </w:numPr>
-        <w:spacing w:after="0"/>
-      </w:pPr>
-      <w:r>
-        <w:t>Ensure compliance with safety policies and proactively address workplace hazards.</w:t>
-      </w:r>
-    </w:p>
-    <w:p>
-      <w:pPr>
-        <w:pStyle w:val="ListParagraph"/>
-        <w:numPr>
-          <w:ilvl w:val="0"/>
-          <w:numId w:val="2"/>
-        </w:numPr>
-        <w:spacing w:after="0"/>
-        <w:rPr>
-          <w:b/>
-          <w:bCs/>
-        </w:rPr>
-      </w:pPr>
-      <w:r>
-        <w:rPr>
-          <w:b/>
-          <w:bCs/>
-        </w:rPr>
-        <w:t>Customer Service, Front Desk Supervisor</w:t>
-      </w:r>
-    </w:p>
-    <w:p>
-      <w:pPr>
-        <w:pStyle w:val="ListParagraph"/>
-        <w:numPr>
-          <w:ilvl w:val="0"/>
-          <w:numId w:val="2"/>
-        </w:numPr>
-        <w:spacing w:after="0"/>
-      </w:pPr>
-      <w:r>
+        <w:rPr>
+          <w:rFonts w:cs="Times New Roman"/>
+          <w:i/>
+          <w:sz w:val="24"/>
+          <w:szCs w:val="24"/>
+        </w:rPr>
         <w:t>Hilton Hotels &amp; Resorts / Aimbridge Hospitality, Oak Brook Terrace, IL</w:t>
       </w:r>
     </w:p>
     <w:p>
       <w:pPr>
-        <w:pStyle w:val="ListParagraph"/>
-        <w:numPr>
-          <w:ilvl w:val="0"/>
-          <w:numId w:val="2"/>
-        </w:numPr>
-        <w:spacing w:after="0"/>
+        <w:pStyle w:val="ResumeBullet"/>
+        <w:rPr>
+          <w:rFonts w:cs="Times New Roman"/>
+          <w:sz w:val="24"/>
+          <w:szCs w:val="24"/>
+        </w:rPr>
       </w:pPr>
       <w:r>
-        <w:t>08/2014 – 02/2024</w:t>
+        <w:rPr>
+          <w:rFonts w:cs="Times New Roman"/>
+          <w:sz w:val="24"/>
+          <w:szCs w:val="24"/>
+        </w:rPr>
+        <w:t>• Supervised front desk operations, trained team members, and supported customer service workflows in a high-volume hotel environment.</w:t>
       </w:r>
     </w:p>
     <w:p>
       <w:pPr>
-        <w:pStyle w:val="ListParagraph"/>
-        <w:numPr>
-          <w:ilvl w:val="1"/>
-          <w:numId w:val="2"/>
-        </w:numPr>
-        <w:spacing w:after="0"/>
+        <w:pStyle w:val="ResumeBullet"/>
+        <w:rPr>
+          <w:rFonts w:cs="Times New Roman"/>
+          <w:sz w:val="24"/>
+          <w:szCs w:val="24"/>
+        </w:rPr>
       </w:pPr>
       <w:r>
-        <w:t>Delivered exceptional customer service, ensuring positive guest experiences.</w:t>
+        <w:rPr>
+          <w:rFonts w:cs="Times New Roman"/>
+          <w:sz w:val="24"/>
+          <w:szCs w:val="24"/>
+        </w:rPr>
+        <w:t>• Managed reservations, group bookings, guest records, and communication of hotel services to improve guest experience and accuracy.</w:t>
       </w:r>
     </w:p>
     <w:p>
       <w:pPr>
-        <w:pStyle w:val="ListParagraph"/>
-        <w:numPr>
-          <w:ilvl w:val="1"/>
-          <w:numId w:val="2"/>
-        </w:numPr>
-        <w:spacing w:after="0"/>
+        <w:pStyle w:val="ResumeBullet"/>
+        <w:rPr>
+          <w:rFonts w:cs="Times New Roman"/>
+          <w:sz w:val="24"/>
+          <w:szCs w:val="24"/>
+        </w:rPr>
       </w:pPr>
       <w:r>
-        <w:lastRenderedPageBreak/>
-        <w:t>Managed reservations, group bookings, and communicated hotel services.</w:t>
+        <w:rPr>
+          <w:rFonts w:cs="Times New Roman"/>
+          <w:sz w:val="24"/>
+          <w:szCs w:val="24"/>
+        </w:rPr>
+        <w:t>• Resolved guest concerns promptly and professionally while supporting sales through upselling and effective communication.</w:t>
       </w:r>
     </w:p>
     <w:p>
       <w:pPr>
-        <w:pStyle w:val="ListParagraph"/>
-        <w:numPr>
-          <w:ilvl w:val="1"/>
-          <w:numId w:val="2"/>
-        </w:numPr>
-        <w:spacing w:after="0"/>
+        <w:pStyle w:val="ResumeBullet"/>
+        <w:rPr>
+          <w:rFonts w:cs="Times New Roman"/>
+          <w:sz w:val="24"/>
+          <w:szCs w:val="24"/>
+        </w:rPr>
       </w:pPr>
       <w:r>
-        <w:t>Resolved guest complaints promptly and professionally.</w:t>
+        <w:rPr>
+          <w:rFonts w:cs="Times New Roman"/>
+          <w:sz w:val="24"/>
+          <w:szCs w:val="24"/>
+        </w:rPr>
+        <w:t>• Supported business center computer hardware and software, including Windows system troubleshooting and basic documentation.</w:t>
       </w:r>
     </w:p>
     <w:p>
       <w:pPr>
-        <w:pStyle w:val="ListParagraph"/>
-        <w:numPr>
-          <w:ilvl w:val="1"/>
-          <w:numId w:val="2"/>
-        </w:numPr>
-        <w:spacing w:after="0"/>
+        <w:pStyle w:val="ResumeBullet"/>
+        <w:rPr>
+          <w:rFonts w:cs="Times New Roman"/>
+          <w:sz w:val="24"/>
+          <w:szCs w:val="24"/>
+        </w:rPr>
+      </w:pPr>
+    </w:p>
+    <w:p>
+      <w:pPr>
+        <w:pBdr>
+          <w:bottom w:val="single" w:sz="6" w:space="1" w:color="000000"/>
+        </w:pBdr>
+        <w:spacing w:before="80" w:after="20" w:line="240" w:lineRule="auto"/>
+        <w:rPr>
+          <w:rFonts w:cs="Times New Roman"/>
+          <w:b/>
+          <w:sz w:val="26"/>
+          <w:szCs w:val="26"/>
+        </w:rPr>
       </w:pPr>
       <w:r>
-        <w:t>Supervised front desk operations and trained team members.</w:t>
+        <w:rPr>
+          <w:rFonts w:cs="Times New Roman"/>
+          <w:b/>
+          <w:sz w:val="26"/>
+          <w:szCs w:val="26"/>
+        </w:rPr>
+        <w:t>PROJECTS</w:t>
       </w:r>
     </w:p>
     <w:p>
       <w:pPr>
-        <w:pStyle w:val="ListParagraph"/>
-        <w:numPr>
-          <w:ilvl w:val="1"/>
-          <w:numId w:val="2"/>
-        </w:numPr>
-        <w:spacing w:after="0"/>
+        <w:tabs>
+          <w:tab w:val="right" w:pos="10512"/>
+        </w:tabs>
+        <w:spacing w:before="40" w:after="0" w:line="240" w:lineRule="auto"/>
+        <w:rPr>
+          <w:rFonts w:cs="Times New Roman"/>
+          <w:sz w:val="24"/>
+          <w:szCs w:val="24"/>
+        </w:rPr>
       </w:pPr>
       <w:r>
-        <w:t>Increased sales through upselling and effective communication.</w:t>
+        <w:rPr>
+          <w:rFonts w:cs="Times New Roman"/>
+          <w:b/>
+          <w:sz w:val="24"/>
+          <w:szCs w:val="24"/>
+        </w:rPr>
+        <w:t>Disaster Relief Resource Coordination System (DRRCS)</w:t>
+      </w:r>
+      <w:r>
+        <w:rPr>
+          <w:rFonts w:cs="Times New Roman"/>
+          <w:sz w:val="24"/>
+          <w:szCs w:val="24"/>
+        </w:rPr>
+        <w:tab/>
+        <w:t>Master’s Capstone Project at Lewis University</w:t>
       </w:r>
     </w:p>
     <w:p>
       <w:pPr>
-        <w:pStyle w:val="ListParagraph"/>
-        <w:numPr>
-          <w:ilvl w:val="1"/>
-          <w:numId w:val="2"/>
-        </w:numPr>
-        <w:spacing w:after="0"/>
+        <w:spacing w:after="0" w:line="240" w:lineRule="auto"/>
+        <w:rPr>
+          <w:rFonts w:cs="Times New Roman"/>
+          <w:sz w:val="24"/>
+          <w:szCs w:val="24"/>
+        </w:rPr>
       </w:pPr>
       <w:r>
-        <w:t>Maintained accurate records for efficient front desk processes.</w:t>
+        <w:rPr>
+          <w:rFonts w:cs="Times New Roman"/>
+          <w:i/>
+          <w:sz w:val="24"/>
+          <w:szCs w:val="24"/>
+        </w:rPr>
+        <w:t>React, Vite, Java 17, Spring Boot, Spring Security, JWT, MongoDB, Redis, Apache Kafka, Docker Compose, REST APIs, OpenAPI/Swagger, Tailwind CSS, Material UI</w:t>
       </w:r>
     </w:p>
     <w:p>
       <w:pPr>
-        <w:pStyle w:val="ListParagraph"/>
-        <w:numPr>
-          <w:ilvl w:val="1"/>
-          <w:numId w:val="2"/>
-        </w:numPr>
-        <w:spacing w:after="0"/>
+        <w:pStyle w:val="ResumeBullet"/>
+        <w:rPr>
+          <w:rFonts w:cs="Times New Roman"/>
+          <w:sz w:val="24"/>
+          <w:szCs w:val="24"/>
+        </w:rPr>
       </w:pPr>
       <w:r>
-        <w:t>Proficient in hotel management software and systems.</w:t>
+        <w:rPr>
+          <w:rFonts w:cs="Times New Roman"/>
+          <w:sz w:val="24"/>
+          <w:szCs w:val="24"/>
+        </w:rPr>
+        <w:t>• Built a full-stack capstone application that helps disaster response teams submit, track, assign, and manage emergency relief requests.</w:t>
       </w:r>
     </w:p>
     <w:p>
       <w:pPr>
-        <w:pStyle w:val="Heading1"/>
+        <w:pStyle w:val="ResumeBullet"/>
+        <w:rPr>
+          <w:rFonts w:cs="Times New Roman"/>
+          <w:sz w:val="24"/>
+          <w:szCs w:val="24"/>
+        </w:rPr>
       </w:pPr>
       <w:r>
-        <w:t>Projects</w:t>
+        <w:rPr>
+          <w:rFonts w:cs="Times New Roman"/>
+          <w:sz w:val="24"/>
+          <w:szCs w:val="24"/>
+        </w:rPr>
+        <w:t>• Developed secure Spring Boot REST APIs with JWT authentication, role-based access control, MongoDB persistence, Redis caching and rate limiting, and Kafka-based event notifications.</w:t>
       </w:r>
     </w:p>
     <w:p>
       <w:pPr>
-        <w:pStyle w:val="ListParagraph"/>
-        <w:numPr>
-          <w:ilvl w:val="0"/>
-          <w:numId w:val="1"/>
-        </w:numPr>
-        <w:spacing w:after="0"/>
-        <w:rPr>
-          <w:b/>
-          <w:bCs/>
+        <w:pStyle w:val="ResumeBullet"/>
+        <w:rPr>
+          <w:rFonts w:cs="Times New Roman"/>
+          <w:sz w:val="24"/>
+          <w:szCs w:val="24"/>
         </w:rPr>
       </w:pPr>
       <w:r>
         <w:rPr>
-          <w:b/>
-          <w:bCs/>
-        </w:rPr>
-        <w:t>Software Systems Capstone Project, Lewis University</w:t>
+          <w:rFonts w:cs="Times New Roman"/>
+          <w:sz w:val="24"/>
+          <w:szCs w:val="24"/>
+        </w:rPr>
+        <w:t>• Designed a React/Vite frontend with protected dashboards, public request submission, tracking-code lookup, volunteer task views, analytics, and notification pages.</w:t>
       </w:r>
     </w:p>
     <w:p>
       <w:pPr>
-        <w:pStyle w:val="ListParagraph"/>
-        <w:numPr>
-          <w:ilvl w:val="0"/>
-          <w:numId w:val="1"/>
-        </w:numPr>
-        <w:spacing w:after="0"/>
+        <w:pStyle w:val="ResumeBullet"/>
+        <w:rPr>
+          <w:rFonts w:cs="Times New Roman"/>
+          <w:sz w:val="24"/>
+          <w:szCs w:val="24"/>
+        </w:rPr>
       </w:pPr>
       <w:r>
-        <w:t>Designed and developed a responsive web application for volunteers.</w:t>
+        <w:rPr>
+          <w:rFonts w:cs="Times New Roman"/>
+          <w:sz w:val="24"/>
+          <w:szCs w:val="24"/>
+        </w:rPr>
+        <w:t>• Containerized supporting services with Docker Compose, including MongoDB, Redis, Kafka, Zookeeper, and Kafka UI for local development.</w:t>
       </w:r>
     </w:p>
     <w:p>
       <w:pPr>
-        <w:pStyle w:val="ListParagraph"/>
-        <w:numPr>
-          <w:ilvl w:val="0"/>
-          <w:numId w:val="1"/>
-        </w:numPr>
-        <w:spacing w:after="0"/>
+        <w:tabs>
+          <w:tab w:val="right" w:pos="10512"/>
+        </w:tabs>
+        <w:spacing w:before="40" w:after="0" w:line="240" w:lineRule="auto"/>
+        <w:rPr>
+          <w:rFonts w:cs="Times New Roman"/>
+          <w:sz w:val="24"/>
+          <w:szCs w:val="24"/>
+        </w:rPr>
       </w:pPr>
       <w:r>
-        <w:t>Integrated APIs using ReactJS, CSS, HTML5, JavaScript, NodeJS, and Firebase.</w:t>
+        <w:rPr>
+          <w:rFonts w:cs="Times New Roman"/>
+          <w:b/>
+          <w:sz w:val="24"/>
+          <w:szCs w:val="24"/>
+        </w:rPr>
+        <w:t>Software Systems Capstone Project - Volunteer Web Application</w:t>
+      </w:r>
+      <w:r>
+        <w:rPr>
+          <w:rFonts w:cs="Times New Roman"/>
+          <w:sz w:val="24"/>
+          <w:szCs w:val="24"/>
+        </w:rPr>
+        <w:tab/>
+        <w:t>Project at Lewis University</w:t>
       </w:r>
     </w:p>
     <w:p>
       <w:pPr>
-        <w:pStyle w:val="ListParagraph"/>
-        <w:numPr>
-          <w:ilvl w:val="0"/>
-          <w:numId w:val="1"/>
-        </w:numPr>
-        <w:spacing w:after="0"/>
+        <w:pStyle w:val="ResumeBullet"/>
+        <w:rPr>
+          <w:rFonts w:cs="Times New Roman"/>
+          <w:sz w:val="24"/>
+          <w:szCs w:val="24"/>
+        </w:rPr>
       </w:pPr>
       <w:r>
-        <w:t xml:space="preserve">Deployed the application. </w:t>
+        <w:rPr>
+          <w:rFonts w:cs="Times New Roman"/>
+          <w:sz w:val="24"/>
+          <w:szCs w:val="24"/>
+        </w:rPr>
+        <w:t>• Designed and developed a responsive web application that allows volunteers to discover organizations in need.</w:t>
       </w:r>
-      <w:hyperlink r:id="rId7">
+    </w:p>
+    <w:p>
+      <w:pPr>
+        <w:pStyle w:val="ResumeBullet"/>
+        <w:rPr>
+          <w:rFonts w:cs="Times New Roman"/>
+          <w:sz w:val="24"/>
+          <w:szCs w:val="24"/>
+        </w:rPr>
+      </w:pPr>
+      <w:r>
+        <w:rPr>
+          <w:rFonts w:cs="Times New Roman"/>
+          <w:sz w:val="24"/>
+          <w:szCs w:val="24"/>
+        </w:rPr>
+        <w:t>• Integrated ReactJS, CSS, HTML5, JavaScript, Node.js, Firebase, and external APIs; deployed the application at https://volunteer-project-e97cb.web.app/.</w:t>
+      </w:r>
+    </w:p>
+    <w:p>
+      <w:pPr>
+        <w:tabs>
+          <w:tab w:val="right" w:pos="10512"/>
+        </w:tabs>
+        <w:spacing w:before="40" w:after="0" w:line="240" w:lineRule="auto"/>
+        <w:rPr>
+          <w:rFonts w:cs="Times New Roman"/>
+          <w:sz w:val="24"/>
+          <w:szCs w:val="24"/>
+        </w:rPr>
+      </w:pPr>
+      <w:r>
+        <w:rPr>
+          <w:rFonts w:cs="Times New Roman"/>
+          <w:b/>
+          <w:sz w:val="24"/>
+          <w:szCs w:val="24"/>
+        </w:rPr>
+        <w:t>MQS Company - HVAC Web Application</w:t>
+      </w:r>
+      <w:r>
+        <w:rPr>
+          <w:rFonts w:cs="Times New Roman"/>
+          <w:sz w:val="24"/>
+          <w:szCs w:val="24"/>
+        </w:rPr>
+        <w:tab/>
+        <w:t>Client Website Project</w:t>
+      </w:r>
+    </w:p>
+    <w:p>
+      <w:pPr>
+        <w:pStyle w:val="ResumeBullet"/>
+        <w:rPr>
+          <w:rFonts w:cs="Times New Roman"/>
+          <w:sz w:val="24"/>
+          <w:szCs w:val="24"/>
+        </w:rPr>
+      </w:pPr>
+      <w:r>
+        <w:rPr>
+          <w:rFonts w:cs="Times New Roman"/>
+          <w:sz w:val="24"/>
+          <w:szCs w:val="24"/>
+        </w:rPr>
+        <w:t xml:space="preserve">• Developed and maintained the MQS HVAC website on WIX with responsive pages, improved visuals, SEO-friendly content, and live deployment at </w:t>
+      </w:r>
+      <w:hyperlink r:id="rId8" w:history="1">
         <w:r>
           <w:rPr>
             <w:rStyle w:val="Hyperlink"/>
-          </w:rPr>
-          <w:t>https://volunteer-project-e97cb.web.app/</w:t>
-        </w:r>
-      </w:hyperlink>
-    </w:p>
-    <w:p>
-      <w:pPr>
-        <w:pStyle w:val="ListParagraph"/>
-        <w:numPr>
-          <w:ilvl w:val="0"/>
-          <w:numId w:val="1"/>
-        </w:numPr>
-        <w:spacing w:after="0"/>
-        <w:rPr>
-          <w:b/>
-          <w:bCs/>
-        </w:rPr>
-      </w:pPr>
-      <w:r>
-        <w:rPr>
-          <w:b/>
-          <w:bCs/>
-        </w:rPr>
-        <w:t>MQS Company - HVAC Web Application</w:t>
-      </w:r>
-    </w:p>
-    <w:p>
-      <w:pPr>
-        <w:pStyle w:val="ListParagraph"/>
-        <w:numPr>
-          <w:ilvl w:val="0"/>
-          <w:numId w:val="1"/>
-        </w:numPr>
-        <w:spacing w:after="0"/>
-      </w:pPr>
-      <w:r>
-        <w:t>Developed the 'MQS' HVAC website on WIX, improving online visibility and client inquiries.</w:t>
-      </w:r>
-    </w:p>
-    <w:p>
-      <w:pPr>
-        <w:pStyle w:val="ListParagraph"/>
-        <w:numPr>
-          <w:ilvl w:val="0"/>
-          <w:numId w:val="1"/>
-        </w:numPr>
-        <w:spacing w:after="0"/>
-      </w:pPr>
-      <w:r>
-        <w:t>Implemented SEO-friendly content and responsive design.</w:t>
-      </w:r>
-    </w:p>
-    <w:p>
-      <w:pPr>
-        <w:pStyle w:val="ListParagraph"/>
-        <w:numPr>
-          <w:ilvl w:val="0"/>
-          <w:numId w:val="1"/>
-        </w:numPr>
-        <w:spacing w:after="0"/>
-      </w:pPr>
-      <w:r>
-        <w:t xml:space="preserve">Deployed the site. </w:t>
-      </w:r>
-      <w:hyperlink r:id="rId8">
-        <w:r>
-          <w:rPr>
-            <w:rStyle w:val="Hyperlink"/>
+            <w:rFonts w:cs="Times New Roman"/>
+            <w:sz w:val="24"/>
+            <w:szCs w:val="24"/>
           </w:rPr>
           <w:t>https://www.mqshvac.com/</w:t>
         </w:r>
       </w:hyperlink>
-    </w:p>
-    <w:p>
-      <w:pPr>
-        <w:pStyle w:val="ListParagraph"/>
-        <w:numPr>
-          <w:ilvl w:val="0"/>
-          <w:numId w:val="1"/>
-        </w:numPr>
-        <w:spacing w:after="0"/>
-        <w:rPr>
-          <w:b/>
-          <w:bCs/>
-        </w:rPr>
-      </w:pPr>
       <w:r>
         <w:rPr>
-          <w:b/>
-          <w:bCs/>
-        </w:rPr>
-        <w:t>Albert Manick Website</w:t>
+          <w:rFonts w:cs="Times New Roman"/>
+          <w:sz w:val="24"/>
+          <w:szCs w:val="24"/>
+        </w:rPr>
+        <w:t>.</w:t>
       </w:r>
     </w:p>
     <w:p>
       <w:pPr>
-        <w:pStyle w:val="ListParagraph"/>
-        <w:numPr>
-          <w:ilvl w:val="0"/>
-          <w:numId w:val="1"/>
-        </w:numPr>
-        <w:spacing w:after="0"/>
+        <w:pStyle w:val="ResumeBullet"/>
+        <w:rPr>
+          <w:rFonts w:cs="Times New Roman"/>
+          <w:sz w:val="24"/>
+          <w:szCs w:val="24"/>
+        </w:rPr>
+      </w:pPr>
+    </w:p>
+    <w:p>
+      <w:pPr>
+        <w:pBdr>
+          <w:bottom w:val="single" w:sz="6" w:space="1" w:color="000000"/>
+        </w:pBdr>
+        <w:spacing w:before="80" w:after="20" w:line="240" w:lineRule="auto"/>
+        <w:rPr>
+          <w:rFonts w:cs="Times New Roman"/>
+          <w:b/>
+          <w:sz w:val="26"/>
+          <w:szCs w:val="26"/>
+        </w:rPr>
       </w:pPr>
       <w:r>
-        <w:t>Designed and developed a personal website using Django, CSS, HTML, and JavaScript.</w:t>
+        <w:rPr>
+          <w:rFonts w:cs="Times New Roman"/>
+          <w:b/>
+          <w:sz w:val="26"/>
+          <w:szCs w:val="26"/>
+        </w:rPr>
+        <w:t>LANGUAGE SKILLS</w:t>
       </w:r>
     </w:p>
     <w:p>
       <w:pPr>
-        <w:pStyle w:val="ListParagraph"/>
-        <w:numPr>
-          <w:ilvl w:val="0"/>
-          <w:numId w:val="1"/>
-        </w:numPr>
-        <w:spacing w:after="0"/>
+        <w:pStyle w:val="ResumeBullet"/>
+        <w:rPr>
+          <w:rFonts w:cs="Times New Roman"/>
+          <w:sz w:val="24"/>
+          <w:szCs w:val="24"/>
+        </w:rPr>
       </w:pPr>
       <w:r>
-        <w:t>Implemented backend functionality and responsive front-end.</w:t>
+        <w:rPr>
+          <w:rFonts w:cs="Times New Roman"/>
+          <w:sz w:val="24"/>
+          <w:szCs w:val="24"/>
+        </w:rPr>
+        <w:t>• English</w:t>
       </w:r>
     </w:p>
     <w:p>
       <w:pPr>
-        <w:pStyle w:val="ListParagraph"/>
-        <w:numPr>
-          <w:ilvl w:val="0"/>
-          <w:numId w:val="1"/>
-        </w:numPr>
-        <w:spacing w:after="0"/>
+        <w:pStyle w:val="ResumeBullet"/>
+        <w:rPr>
+          <w:rFonts w:cs="Times New Roman"/>
+          <w:sz w:val="24"/>
+          <w:szCs w:val="24"/>
+        </w:rPr>
       </w:pPr>
       <w:r>
-        <w:t xml:space="preserve">Deployed the website. </w:t>
+        <w:rPr>
+          <w:rFonts w:cs="Times New Roman"/>
+          <w:sz w:val="24"/>
+          <w:szCs w:val="24"/>
+        </w:rPr>
+        <w:t>• French</w:t>
       </w:r>
-      <w:hyperlink r:id="rId9">
-        <w:r>
-          <w:rPr>
-            <w:rStyle w:val="Hyperlink"/>
-          </w:rPr>
-          <w:t>https://www.albertmanick.com/</w:t>
-        </w:r>
-      </w:hyperlink>
     </w:p>
     <w:p>
+      <w:pPr>
+        <w:pStyle w:val="ResumeBullet"/>
+        <w:rPr>
+          <w:rFonts w:cs="Times New Roman"/>
+          <w:sz w:val="24"/>
+          <w:szCs w:val="24"/>
+        </w:rPr>
+      </w:pPr>
       <w:r>
-        <w:t>References available upon request.</w:t>
+        <w:rPr>
+          <w:rFonts w:cs="Times New Roman"/>
+          <w:sz w:val="24"/>
+          <w:szCs w:val="24"/>
+        </w:rPr>
+        <w:t>• Creole</w:t>
+      </w:r>
+    </w:p>
+    <w:p>
+      <w:pPr>
+        <w:pStyle w:val="ResumeBullet"/>
+        <w:rPr>
+          <w:rFonts w:cs="Times New Roman"/>
+          <w:sz w:val="24"/>
+          <w:szCs w:val="24"/>
+        </w:rPr>
+      </w:pPr>
+      <w:r>
+        <w:rPr>
+          <w:rFonts w:cs="Times New Roman"/>
+          <w:sz w:val="24"/>
+          <w:szCs w:val="24"/>
+        </w:rPr>
+        <w:t>• Spanish</w:t>
       </w:r>
     </w:p>
     <w:sectPr>
       <w:pgSz w:w="12240" w:h="15840"/>
-      <w:pgMar w:top="1440" w:right="1800" w:bottom="1440" w:left="1800" w:header="720" w:footer="720" w:gutter="0"/>
+      <w:pgMar w:top="648" w:right="792" w:bottom="648" w:left="792" w:header="720" w:footer="720" w:gutter="0"/>
       <w:cols w:space="720"/>
       <w:docGrid w:linePitch="360"/>
     </w:sectPr>
@@ -1260,1164 +1498,31 @@
       </w:rPr>
     </w:lvl>
   </w:abstractNum>
-  <w:abstractNum w:abstractNumId="9" w15:restartNumberingAfterBreak="0">
-    <w:nsid w:val="065B6A72"/>
-    <w:multiLevelType w:val="hybridMultilevel"/>
-    <w:tmpl w:val="04E4036A"/>
-    <w:lvl w:ilvl="0" w:tplc="53BA800A">
-      <w:start w:val="1"/>
-      <w:numFmt w:val="bullet"/>
-      <w:lvlText w:val=""/>
-      <w:lvlJc w:val="left"/>
-      <w:pPr>
-        <w:ind w:left="720" w:hanging="360"/>
-      </w:pPr>
-      <w:rPr>
-        <w:rFonts w:ascii="Symbol" w:hAnsi="Symbol" w:hint="default"/>
-      </w:rPr>
-    </w:lvl>
-    <w:lvl w:ilvl="1" w:tplc="986023F2">
-      <w:start w:val="1"/>
-      <w:numFmt w:val="bullet"/>
-      <w:lvlText w:val="o"/>
-      <w:lvlJc w:val="left"/>
-      <w:pPr>
-        <w:ind w:left="1440" w:hanging="360"/>
-      </w:pPr>
-      <w:rPr>
-        <w:rFonts w:ascii="Courier New" w:hAnsi="Courier New" w:hint="default"/>
-      </w:rPr>
-    </w:lvl>
-    <w:lvl w:ilvl="2" w:tplc="4A4CA9A6">
-      <w:start w:val="1"/>
-      <w:numFmt w:val="bullet"/>
-      <w:lvlText w:val=""/>
-      <w:lvlJc w:val="left"/>
-      <w:pPr>
-        <w:ind w:left="2160" w:hanging="360"/>
-      </w:pPr>
-      <w:rPr>
-        <w:rFonts w:ascii="Wingdings" w:hAnsi="Wingdings" w:hint="default"/>
-      </w:rPr>
-    </w:lvl>
-    <w:lvl w:ilvl="3" w:tplc="C8C6F50A">
-      <w:start w:val="1"/>
-      <w:numFmt w:val="bullet"/>
-      <w:lvlText w:val=""/>
-      <w:lvlJc w:val="left"/>
-      <w:pPr>
-        <w:ind w:left="2880" w:hanging="360"/>
-      </w:pPr>
-      <w:rPr>
-        <w:rFonts w:ascii="Symbol" w:hAnsi="Symbol" w:hint="default"/>
-      </w:rPr>
-    </w:lvl>
-    <w:lvl w:ilvl="4" w:tplc="10CCD20C">
-      <w:start w:val="1"/>
-      <w:numFmt w:val="bullet"/>
-      <w:lvlText w:val="o"/>
-      <w:lvlJc w:val="left"/>
-      <w:pPr>
-        <w:ind w:left="3600" w:hanging="360"/>
-      </w:pPr>
-      <w:rPr>
-        <w:rFonts w:ascii="Courier New" w:hAnsi="Courier New" w:hint="default"/>
-      </w:rPr>
-    </w:lvl>
-    <w:lvl w:ilvl="5" w:tplc="AF44744E">
-      <w:start w:val="1"/>
-      <w:numFmt w:val="bullet"/>
-      <w:lvlText w:val=""/>
-      <w:lvlJc w:val="left"/>
-      <w:pPr>
-        <w:ind w:left="4320" w:hanging="360"/>
-      </w:pPr>
-      <w:rPr>
-        <w:rFonts w:ascii="Wingdings" w:hAnsi="Wingdings" w:hint="default"/>
-      </w:rPr>
-    </w:lvl>
-    <w:lvl w:ilvl="6" w:tplc="361E7B2C">
-      <w:start w:val="1"/>
-      <w:numFmt w:val="bullet"/>
-      <w:lvlText w:val=""/>
-      <w:lvlJc w:val="left"/>
-      <w:pPr>
-        <w:ind w:left="5040" w:hanging="360"/>
-      </w:pPr>
-      <w:rPr>
-        <w:rFonts w:ascii="Symbol" w:hAnsi="Symbol" w:hint="default"/>
-      </w:rPr>
-    </w:lvl>
-    <w:lvl w:ilvl="7" w:tplc="BA04CED0">
-      <w:start w:val="1"/>
-      <w:numFmt w:val="bullet"/>
-      <w:lvlText w:val="o"/>
-      <w:lvlJc w:val="left"/>
-      <w:pPr>
-        <w:ind w:left="5760" w:hanging="360"/>
-      </w:pPr>
-      <w:rPr>
-        <w:rFonts w:ascii="Courier New" w:hAnsi="Courier New" w:hint="default"/>
-      </w:rPr>
-    </w:lvl>
-    <w:lvl w:ilvl="8" w:tplc="83CEED90">
-      <w:start w:val="1"/>
-      <w:numFmt w:val="bullet"/>
-      <w:lvlText w:val=""/>
-      <w:lvlJc w:val="left"/>
-      <w:pPr>
-        <w:ind w:left="6480" w:hanging="360"/>
-      </w:pPr>
-      <w:rPr>
-        <w:rFonts w:ascii="Wingdings" w:hAnsi="Wingdings" w:hint="default"/>
-      </w:rPr>
-    </w:lvl>
-  </w:abstractNum>
-  <w:abstractNum w:abstractNumId="10" w15:restartNumberingAfterBreak="0">
-    <w:nsid w:val="07ACDAFA"/>
-    <w:multiLevelType w:val="hybridMultilevel"/>
-    <w:tmpl w:val="4F8E709E"/>
-    <w:lvl w:ilvl="0" w:tplc="C7D60536">
-      <w:start w:val="1"/>
-      <w:numFmt w:val="bullet"/>
-      <w:lvlText w:val=""/>
-      <w:lvlJc w:val="left"/>
-      <w:pPr>
-        <w:ind w:left="720" w:hanging="360"/>
-      </w:pPr>
-      <w:rPr>
-        <w:rFonts w:ascii="Symbol" w:hAnsi="Symbol" w:hint="default"/>
-      </w:rPr>
-    </w:lvl>
-    <w:lvl w:ilvl="1" w:tplc="4C8E3568">
-      <w:start w:val="1"/>
-      <w:numFmt w:val="bullet"/>
-      <w:lvlText w:val="o"/>
-      <w:lvlJc w:val="left"/>
-      <w:pPr>
-        <w:ind w:left="1440" w:hanging="360"/>
-      </w:pPr>
-      <w:rPr>
-        <w:rFonts w:ascii="Courier New" w:hAnsi="Courier New" w:hint="default"/>
-      </w:rPr>
-    </w:lvl>
-    <w:lvl w:ilvl="2" w:tplc="25CC6DD2">
-      <w:start w:val="1"/>
-      <w:numFmt w:val="bullet"/>
-      <w:lvlText w:val=""/>
-      <w:lvlJc w:val="left"/>
-      <w:pPr>
-        <w:ind w:left="2160" w:hanging="360"/>
-      </w:pPr>
-      <w:rPr>
-        <w:rFonts w:ascii="Wingdings" w:hAnsi="Wingdings" w:hint="default"/>
-      </w:rPr>
-    </w:lvl>
-    <w:lvl w:ilvl="3" w:tplc="AF5AC60A">
-      <w:start w:val="1"/>
-      <w:numFmt w:val="bullet"/>
-      <w:lvlText w:val=""/>
-      <w:lvlJc w:val="left"/>
-      <w:pPr>
-        <w:ind w:left="2880" w:hanging="360"/>
-      </w:pPr>
-      <w:rPr>
-        <w:rFonts w:ascii="Symbol" w:hAnsi="Symbol" w:hint="default"/>
-      </w:rPr>
-    </w:lvl>
-    <w:lvl w:ilvl="4" w:tplc="DFD201CA">
-      <w:start w:val="1"/>
-      <w:numFmt w:val="bullet"/>
-      <w:lvlText w:val="o"/>
-      <w:lvlJc w:val="left"/>
-      <w:pPr>
-        <w:ind w:left="3600" w:hanging="360"/>
-      </w:pPr>
-      <w:rPr>
-        <w:rFonts w:ascii="Courier New" w:hAnsi="Courier New" w:hint="default"/>
-      </w:rPr>
-    </w:lvl>
-    <w:lvl w:ilvl="5" w:tplc="15CCA3FA">
-      <w:start w:val="1"/>
-      <w:numFmt w:val="bullet"/>
-      <w:lvlText w:val=""/>
-      <w:lvlJc w:val="left"/>
-      <w:pPr>
-        <w:ind w:left="4320" w:hanging="360"/>
-      </w:pPr>
-      <w:rPr>
-        <w:rFonts w:ascii="Wingdings" w:hAnsi="Wingdings" w:hint="default"/>
-      </w:rPr>
-    </w:lvl>
-    <w:lvl w:ilvl="6" w:tplc="2B3C1EFC">
-      <w:start w:val="1"/>
-      <w:numFmt w:val="bullet"/>
-      <w:lvlText w:val=""/>
-      <w:lvlJc w:val="left"/>
-      <w:pPr>
-        <w:ind w:left="5040" w:hanging="360"/>
-      </w:pPr>
-      <w:rPr>
-        <w:rFonts w:ascii="Symbol" w:hAnsi="Symbol" w:hint="default"/>
-      </w:rPr>
-    </w:lvl>
-    <w:lvl w:ilvl="7" w:tplc="F8DA7BE6">
-      <w:start w:val="1"/>
-      <w:numFmt w:val="bullet"/>
-      <w:lvlText w:val="o"/>
-      <w:lvlJc w:val="left"/>
-      <w:pPr>
-        <w:ind w:left="5760" w:hanging="360"/>
-      </w:pPr>
-      <w:rPr>
-        <w:rFonts w:ascii="Courier New" w:hAnsi="Courier New" w:hint="default"/>
-      </w:rPr>
-    </w:lvl>
-    <w:lvl w:ilvl="8" w:tplc="9EEEBC2E">
-      <w:start w:val="1"/>
-      <w:numFmt w:val="bullet"/>
-      <w:lvlText w:val=""/>
-      <w:lvlJc w:val="left"/>
-      <w:pPr>
-        <w:ind w:left="6480" w:hanging="360"/>
-      </w:pPr>
-      <w:rPr>
-        <w:rFonts w:ascii="Wingdings" w:hAnsi="Wingdings" w:hint="default"/>
-      </w:rPr>
-    </w:lvl>
-  </w:abstractNum>
-  <w:abstractNum w:abstractNumId="11" w15:restartNumberingAfterBreak="0">
-    <w:nsid w:val="1196A585"/>
-    <w:multiLevelType w:val="hybridMultilevel"/>
-    <w:tmpl w:val="AF748DD4"/>
-    <w:lvl w:ilvl="0" w:tplc="A02C257C">
-      <w:start w:val="1"/>
-      <w:numFmt w:val="bullet"/>
-      <w:lvlText w:val=""/>
-      <w:lvlJc w:val="left"/>
-      <w:pPr>
-        <w:ind w:left="720" w:hanging="360"/>
-      </w:pPr>
-      <w:rPr>
-        <w:rFonts w:ascii="Symbol" w:hAnsi="Symbol" w:hint="default"/>
-      </w:rPr>
-    </w:lvl>
-    <w:lvl w:ilvl="1" w:tplc="927AE950">
-      <w:start w:val="1"/>
-      <w:numFmt w:val="bullet"/>
-      <w:lvlText w:val="o"/>
-      <w:lvlJc w:val="left"/>
-      <w:pPr>
-        <w:ind w:left="1440" w:hanging="360"/>
-      </w:pPr>
-      <w:rPr>
-        <w:rFonts w:ascii="Courier New" w:hAnsi="Courier New" w:hint="default"/>
-      </w:rPr>
-    </w:lvl>
-    <w:lvl w:ilvl="2" w:tplc="1FE4D072">
-      <w:start w:val="1"/>
-      <w:numFmt w:val="bullet"/>
-      <w:lvlText w:val=""/>
-      <w:lvlJc w:val="left"/>
-      <w:pPr>
-        <w:ind w:left="2160" w:hanging="360"/>
-      </w:pPr>
-      <w:rPr>
-        <w:rFonts w:ascii="Wingdings" w:hAnsi="Wingdings" w:hint="default"/>
-      </w:rPr>
-    </w:lvl>
-    <w:lvl w:ilvl="3" w:tplc="61AA2FE4">
-      <w:start w:val="1"/>
-      <w:numFmt w:val="bullet"/>
-      <w:lvlText w:val=""/>
-      <w:lvlJc w:val="left"/>
-      <w:pPr>
-        <w:ind w:left="2880" w:hanging="360"/>
-      </w:pPr>
-      <w:rPr>
-        <w:rFonts w:ascii="Symbol" w:hAnsi="Symbol" w:hint="default"/>
-      </w:rPr>
-    </w:lvl>
-    <w:lvl w:ilvl="4" w:tplc="A6E40932">
-      <w:start w:val="1"/>
-      <w:numFmt w:val="bullet"/>
-      <w:lvlText w:val="o"/>
-      <w:lvlJc w:val="left"/>
-      <w:pPr>
-        <w:ind w:left="3600" w:hanging="360"/>
-      </w:pPr>
-      <w:rPr>
-        <w:rFonts w:ascii="Courier New" w:hAnsi="Courier New" w:hint="default"/>
-      </w:rPr>
-    </w:lvl>
-    <w:lvl w:ilvl="5" w:tplc="0F80FB18">
-      <w:start w:val="1"/>
-      <w:numFmt w:val="bullet"/>
-      <w:lvlText w:val=""/>
-      <w:lvlJc w:val="left"/>
-      <w:pPr>
-        <w:ind w:left="4320" w:hanging="360"/>
-      </w:pPr>
-      <w:rPr>
-        <w:rFonts w:ascii="Wingdings" w:hAnsi="Wingdings" w:hint="default"/>
-      </w:rPr>
-    </w:lvl>
-    <w:lvl w:ilvl="6" w:tplc="8496D544">
-      <w:start w:val="1"/>
-      <w:numFmt w:val="bullet"/>
-      <w:lvlText w:val=""/>
-      <w:lvlJc w:val="left"/>
-      <w:pPr>
-        <w:ind w:left="5040" w:hanging="360"/>
-      </w:pPr>
-      <w:rPr>
-        <w:rFonts w:ascii="Symbol" w:hAnsi="Symbol" w:hint="default"/>
-      </w:rPr>
-    </w:lvl>
-    <w:lvl w:ilvl="7" w:tplc="128039EA">
-      <w:start w:val="1"/>
-      <w:numFmt w:val="bullet"/>
-      <w:lvlText w:val="o"/>
-      <w:lvlJc w:val="left"/>
-      <w:pPr>
-        <w:ind w:left="5760" w:hanging="360"/>
-      </w:pPr>
-      <w:rPr>
-        <w:rFonts w:ascii="Courier New" w:hAnsi="Courier New" w:hint="default"/>
-      </w:rPr>
-    </w:lvl>
-    <w:lvl w:ilvl="8" w:tplc="13502D0A">
-      <w:start w:val="1"/>
-      <w:numFmt w:val="bullet"/>
-      <w:lvlText w:val=""/>
-      <w:lvlJc w:val="left"/>
-      <w:pPr>
-        <w:ind w:left="6480" w:hanging="360"/>
-      </w:pPr>
-      <w:rPr>
-        <w:rFonts w:ascii="Wingdings" w:hAnsi="Wingdings" w:hint="default"/>
-      </w:rPr>
-    </w:lvl>
-  </w:abstractNum>
-  <w:abstractNum w:abstractNumId="12" w15:restartNumberingAfterBreak="0">
-    <w:nsid w:val="2C0941B3"/>
-    <w:multiLevelType w:val="hybridMultilevel"/>
-    <w:tmpl w:val="7572369C"/>
-    <w:lvl w:ilvl="0" w:tplc="4722743C">
-      <w:start w:val="1"/>
-      <w:numFmt w:val="bullet"/>
-      <w:lvlText w:val=""/>
-      <w:lvlJc w:val="left"/>
-      <w:pPr>
-        <w:ind w:left="720" w:hanging="360"/>
-      </w:pPr>
-      <w:rPr>
-        <w:rFonts w:ascii="Symbol" w:hAnsi="Symbol" w:hint="default"/>
-      </w:rPr>
-    </w:lvl>
-    <w:lvl w:ilvl="1" w:tplc="ACCA61EE">
-      <w:start w:val="1"/>
-      <w:numFmt w:val="bullet"/>
-      <w:lvlText w:val="o"/>
-      <w:lvlJc w:val="left"/>
-      <w:pPr>
-        <w:ind w:left="1440" w:hanging="360"/>
-      </w:pPr>
-      <w:rPr>
-        <w:rFonts w:ascii="Courier New" w:hAnsi="Courier New" w:hint="default"/>
-      </w:rPr>
-    </w:lvl>
-    <w:lvl w:ilvl="2" w:tplc="64C42896">
-      <w:start w:val="1"/>
-      <w:numFmt w:val="bullet"/>
-      <w:lvlText w:val=""/>
-      <w:lvlJc w:val="left"/>
-      <w:pPr>
-        <w:ind w:left="2160" w:hanging="360"/>
-      </w:pPr>
-      <w:rPr>
-        <w:rFonts w:ascii="Wingdings" w:hAnsi="Wingdings" w:hint="default"/>
-      </w:rPr>
-    </w:lvl>
-    <w:lvl w:ilvl="3" w:tplc="6614A55E">
-      <w:start w:val="1"/>
-      <w:numFmt w:val="bullet"/>
-      <w:lvlText w:val=""/>
-      <w:lvlJc w:val="left"/>
-      <w:pPr>
-        <w:ind w:left="2880" w:hanging="360"/>
-      </w:pPr>
-      <w:rPr>
-        <w:rFonts w:ascii="Symbol" w:hAnsi="Symbol" w:hint="default"/>
-      </w:rPr>
-    </w:lvl>
-    <w:lvl w:ilvl="4" w:tplc="B3460CD0">
-      <w:start w:val="1"/>
-      <w:numFmt w:val="bullet"/>
-      <w:lvlText w:val="o"/>
-      <w:lvlJc w:val="left"/>
-      <w:pPr>
-        <w:ind w:left="3600" w:hanging="360"/>
-      </w:pPr>
-      <w:rPr>
-        <w:rFonts w:ascii="Courier New" w:hAnsi="Courier New" w:hint="default"/>
-      </w:rPr>
-    </w:lvl>
-    <w:lvl w:ilvl="5" w:tplc="F92836EE">
-      <w:start w:val="1"/>
-      <w:numFmt w:val="bullet"/>
-      <w:lvlText w:val=""/>
-      <w:lvlJc w:val="left"/>
-      <w:pPr>
-        <w:ind w:left="4320" w:hanging="360"/>
-      </w:pPr>
-      <w:rPr>
-        <w:rFonts w:ascii="Wingdings" w:hAnsi="Wingdings" w:hint="default"/>
-      </w:rPr>
-    </w:lvl>
-    <w:lvl w:ilvl="6" w:tplc="99CA68A8">
-      <w:start w:val="1"/>
-      <w:numFmt w:val="bullet"/>
-      <w:lvlText w:val=""/>
-      <w:lvlJc w:val="left"/>
-      <w:pPr>
-        <w:ind w:left="5040" w:hanging="360"/>
-      </w:pPr>
-      <w:rPr>
-        <w:rFonts w:ascii="Symbol" w:hAnsi="Symbol" w:hint="default"/>
-      </w:rPr>
-    </w:lvl>
-    <w:lvl w:ilvl="7" w:tplc="543AA330">
-      <w:start w:val="1"/>
-      <w:numFmt w:val="bullet"/>
-      <w:lvlText w:val="o"/>
-      <w:lvlJc w:val="left"/>
-      <w:pPr>
-        <w:ind w:left="5760" w:hanging="360"/>
-      </w:pPr>
-      <w:rPr>
-        <w:rFonts w:ascii="Courier New" w:hAnsi="Courier New" w:hint="default"/>
-      </w:rPr>
-    </w:lvl>
-    <w:lvl w:ilvl="8" w:tplc="07709C54">
-      <w:start w:val="1"/>
-      <w:numFmt w:val="bullet"/>
-      <w:lvlText w:val=""/>
-      <w:lvlJc w:val="left"/>
-      <w:pPr>
-        <w:ind w:left="6480" w:hanging="360"/>
-      </w:pPr>
-      <w:rPr>
-        <w:rFonts w:ascii="Wingdings" w:hAnsi="Wingdings" w:hint="default"/>
-      </w:rPr>
-    </w:lvl>
-  </w:abstractNum>
-  <w:abstractNum w:abstractNumId="13" w15:restartNumberingAfterBreak="0">
-    <w:nsid w:val="399C0136"/>
-    <w:multiLevelType w:val="hybridMultilevel"/>
-    <w:tmpl w:val="F9C00402"/>
-    <w:lvl w:ilvl="0" w:tplc="0C4E6B44">
-      <w:start w:val="1"/>
-      <w:numFmt w:val="bullet"/>
-      <w:lvlText w:val=""/>
-      <w:lvlJc w:val="left"/>
-      <w:pPr>
-        <w:ind w:left="720" w:hanging="360"/>
-      </w:pPr>
-      <w:rPr>
-        <w:rFonts w:ascii="Symbol" w:hAnsi="Symbol" w:hint="default"/>
-      </w:rPr>
-    </w:lvl>
-    <w:lvl w:ilvl="1" w:tplc="7A382D6E">
-      <w:start w:val="1"/>
-      <w:numFmt w:val="bullet"/>
-      <w:lvlText w:val="o"/>
-      <w:lvlJc w:val="left"/>
-      <w:pPr>
-        <w:ind w:left="1440" w:hanging="360"/>
-      </w:pPr>
-      <w:rPr>
-        <w:rFonts w:ascii="Courier New" w:hAnsi="Courier New" w:hint="default"/>
-      </w:rPr>
-    </w:lvl>
-    <w:lvl w:ilvl="2" w:tplc="1B7A5A0C">
-      <w:start w:val="1"/>
-      <w:numFmt w:val="bullet"/>
-      <w:lvlText w:val=""/>
-      <w:lvlJc w:val="left"/>
-      <w:pPr>
-        <w:ind w:left="2160" w:hanging="360"/>
-      </w:pPr>
-      <w:rPr>
-        <w:rFonts w:ascii="Wingdings" w:hAnsi="Wingdings" w:hint="default"/>
-      </w:rPr>
-    </w:lvl>
-    <w:lvl w:ilvl="3" w:tplc="D2325D0C">
-      <w:start w:val="1"/>
-      <w:numFmt w:val="bullet"/>
-      <w:lvlText w:val=""/>
-      <w:lvlJc w:val="left"/>
-      <w:pPr>
-        <w:ind w:left="2880" w:hanging="360"/>
-      </w:pPr>
-      <w:rPr>
-        <w:rFonts w:ascii="Symbol" w:hAnsi="Symbol" w:hint="default"/>
-      </w:rPr>
-    </w:lvl>
-    <w:lvl w:ilvl="4" w:tplc="EF52B528">
-      <w:start w:val="1"/>
-      <w:numFmt w:val="bullet"/>
-      <w:lvlText w:val="o"/>
-      <w:lvlJc w:val="left"/>
-      <w:pPr>
-        <w:ind w:left="3600" w:hanging="360"/>
-      </w:pPr>
-      <w:rPr>
-        <w:rFonts w:ascii="Courier New" w:hAnsi="Courier New" w:hint="default"/>
-      </w:rPr>
-    </w:lvl>
-    <w:lvl w:ilvl="5" w:tplc="3F306868">
-      <w:start w:val="1"/>
-      <w:numFmt w:val="bullet"/>
-      <w:lvlText w:val=""/>
-      <w:lvlJc w:val="left"/>
-      <w:pPr>
-        <w:ind w:left="4320" w:hanging="360"/>
-      </w:pPr>
-      <w:rPr>
-        <w:rFonts w:ascii="Wingdings" w:hAnsi="Wingdings" w:hint="default"/>
-      </w:rPr>
-    </w:lvl>
-    <w:lvl w:ilvl="6" w:tplc="EF8EAC66">
-      <w:start w:val="1"/>
-      <w:numFmt w:val="bullet"/>
-      <w:lvlText w:val=""/>
-      <w:lvlJc w:val="left"/>
-      <w:pPr>
-        <w:ind w:left="5040" w:hanging="360"/>
-      </w:pPr>
-      <w:rPr>
-        <w:rFonts w:ascii="Symbol" w:hAnsi="Symbol" w:hint="default"/>
-      </w:rPr>
-    </w:lvl>
-    <w:lvl w:ilvl="7" w:tplc="45A05C5A">
-      <w:start w:val="1"/>
-      <w:numFmt w:val="bullet"/>
-      <w:lvlText w:val="o"/>
-      <w:lvlJc w:val="left"/>
-      <w:pPr>
-        <w:ind w:left="5760" w:hanging="360"/>
-      </w:pPr>
-      <w:rPr>
-        <w:rFonts w:ascii="Courier New" w:hAnsi="Courier New" w:hint="default"/>
-      </w:rPr>
-    </w:lvl>
-    <w:lvl w:ilvl="8" w:tplc="5D563C80">
-      <w:start w:val="1"/>
-      <w:numFmt w:val="bullet"/>
-      <w:lvlText w:val=""/>
-      <w:lvlJc w:val="left"/>
-      <w:pPr>
-        <w:ind w:left="6480" w:hanging="360"/>
-      </w:pPr>
-      <w:rPr>
-        <w:rFonts w:ascii="Wingdings" w:hAnsi="Wingdings" w:hint="default"/>
-      </w:rPr>
-    </w:lvl>
-  </w:abstractNum>
-  <w:abstractNum w:abstractNumId="14" w15:restartNumberingAfterBreak="0">
-    <w:nsid w:val="430681F0"/>
-    <w:multiLevelType w:val="hybridMultilevel"/>
-    <w:tmpl w:val="9C76F32A"/>
-    <w:lvl w:ilvl="0" w:tplc="5B66D2D0">
-      <w:start w:val="1"/>
-      <w:numFmt w:val="bullet"/>
-      <w:lvlText w:val=""/>
-      <w:lvlJc w:val="left"/>
-      <w:pPr>
-        <w:ind w:left="720" w:hanging="360"/>
-      </w:pPr>
-      <w:rPr>
-        <w:rFonts w:ascii="Symbol" w:hAnsi="Symbol" w:hint="default"/>
-      </w:rPr>
-    </w:lvl>
-    <w:lvl w:ilvl="1" w:tplc="EDB261D6">
-      <w:start w:val="1"/>
-      <w:numFmt w:val="bullet"/>
-      <w:lvlText w:val="o"/>
-      <w:lvlJc w:val="left"/>
-      <w:pPr>
-        <w:ind w:left="1440" w:hanging="360"/>
-      </w:pPr>
-      <w:rPr>
-        <w:rFonts w:ascii="Courier New" w:hAnsi="Courier New" w:hint="default"/>
-      </w:rPr>
-    </w:lvl>
-    <w:lvl w:ilvl="2" w:tplc="D7A21460">
-      <w:start w:val="1"/>
-      <w:numFmt w:val="bullet"/>
-      <w:lvlText w:val=""/>
-      <w:lvlJc w:val="left"/>
-      <w:pPr>
-        <w:ind w:left="2160" w:hanging="360"/>
-      </w:pPr>
-      <w:rPr>
-        <w:rFonts w:ascii="Wingdings" w:hAnsi="Wingdings" w:hint="default"/>
-      </w:rPr>
-    </w:lvl>
-    <w:lvl w:ilvl="3" w:tplc="2534B7F8">
-      <w:start w:val="1"/>
-      <w:numFmt w:val="bullet"/>
-      <w:lvlText w:val=""/>
-      <w:lvlJc w:val="left"/>
-      <w:pPr>
-        <w:ind w:left="2880" w:hanging="360"/>
-      </w:pPr>
-      <w:rPr>
-        <w:rFonts w:ascii="Symbol" w:hAnsi="Symbol" w:hint="default"/>
-      </w:rPr>
-    </w:lvl>
-    <w:lvl w:ilvl="4" w:tplc="382C4540">
-      <w:start w:val="1"/>
-      <w:numFmt w:val="bullet"/>
-      <w:lvlText w:val="o"/>
-      <w:lvlJc w:val="left"/>
-      <w:pPr>
-        <w:ind w:left="3600" w:hanging="360"/>
-      </w:pPr>
-      <w:rPr>
-        <w:rFonts w:ascii="Courier New" w:hAnsi="Courier New" w:hint="default"/>
-      </w:rPr>
-    </w:lvl>
-    <w:lvl w:ilvl="5" w:tplc="0BBA5F38">
-      <w:start w:val="1"/>
-      <w:numFmt w:val="bullet"/>
-      <w:lvlText w:val=""/>
-      <w:lvlJc w:val="left"/>
-      <w:pPr>
-        <w:ind w:left="4320" w:hanging="360"/>
-      </w:pPr>
-      <w:rPr>
-        <w:rFonts w:ascii="Wingdings" w:hAnsi="Wingdings" w:hint="default"/>
-      </w:rPr>
-    </w:lvl>
-    <w:lvl w:ilvl="6" w:tplc="5F0A7740">
-      <w:start w:val="1"/>
-      <w:numFmt w:val="bullet"/>
-      <w:lvlText w:val=""/>
-      <w:lvlJc w:val="left"/>
-      <w:pPr>
-        <w:ind w:left="5040" w:hanging="360"/>
-      </w:pPr>
-      <w:rPr>
-        <w:rFonts w:ascii="Symbol" w:hAnsi="Symbol" w:hint="default"/>
-      </w:rPr>
-    </w:lvl>
-    <w:lvl w:ilvl="7" w:tplc="550E4ADE">
-      <w:start w:val="1"/>
-      <w:numFmt w:val="bullet"/>
-      <w:lvlText w:val="o"/>
-      <w:lvlJc w:val="left"/>
-      <w:pPr>
-        <w:ind w:left="5760" w:hanging="360"/>
-      </w:pPr>
-      <w:rPr>
-        <w:rFonts w:ascii="Courier New" w:hAnsi="Courier New" w:hint="default"/>
-      </w:rPr>
-    </w:lvl>
-    <w:lvl w:ilvl="8" w:tplc="B8169FD6">
-      <w:start w:val="1"/>
-      <w:numFmt w:val="bullet"/>
-      <w:lvlText w:val=""/>
-      <w:lvlJc w:val="left"/>
-      <w:pPr>
-        <w:ind w:left="6480" w:hanging="360"/>
-      </w:pPr>
-      <w:rPr>
-        <w:rFonts w:ascii="Wingdings" w:hAnsi="Wingdings" w:hint="default"/>
-      </w:rPr>
-    </w:lvl>
-  </w:abstractNum>
-  <w:abstractNum w:abstractNumId="15" w15:restartNumberingAfterBreak="0">
-    <w:nsid w:val="45BEF940"/>
-    <w:multiLevelType w:val="hybridMultilevel"/>
-    <w:tmpl w:val="602628EE"/>
-    <w:lvl w:ilvl="0" w:tplc="BCF2225C">
-      <w:start w:val="1"/>
-      <w:numFmt w:val="bullet"/>
-      <w:lvlText w:val=""/>
-      <w:lvlJc w:val="left"/>
-      <w:pPr>
-        <w:ind w:left="720" w:hanging="360"/>
-      </w:pPr>
-      <w:rPr>
-        <w:rFonts w:ascii="Symbol" w:hAnsi="Symbol" w:hint="default"/>
-      </w:rPr>
-    </w:lvl>
-    <w:lvl w:ilvl="1" w:tplc="97AAF086">
-      <w:start w:val="1"/>
-      <w:numFmt w:val="bullet"/>
-      <w:lvlText w:val="o"/>
-      <w:lvlJc w:val="left"/>
-      <w:pPr>
-        <w:ind w:left="1440" w:hanging="360"/>
-      </w:pPr>
-      <w:rPr>
-        <w:rFonts w:ascii="Courier New" w:hAnsi="Courier New" w:hint="default"/>
-      </w:rPr>
-    </w:lvl>
-    <w:lvl w:ilvl="2" w:tplc="DB5E3664">
-      <w:start w:val="1"/>
-      <w:numFmt w:val="bullet"/>
-      <w:lvlText w:val=""/>
-      <w:lvlJc w:val="left"/>
-      <w:pPr>
-        <w:ind w:left="2160" w:hanging="360"/>
-      </w:pPr>
-      <w:rPr>
-        <w:rFonts w:ascii="Wingdings" w:hAnsi="Wingdings" w:hint="default"/>
-      </w:rPr>
-    </w:lvl>
-    <w:lvl w:ilvl="3" w:tplc="E9F4D194">
-      <w:start w:val="1"/>
-      <w:numFmt w:val="bullet"/>
-      <w:lvlText w:val=""/>
-      <w:lvlJc w:val="left"/>
-      <w:pPr>
-        <w:ind w:left="2880" w:hanging="360"/>
-      </w:pPr>
-      <w:rPr>
-        <w:rFonts w:ascii="Symbol" w:hAnsi="Symbol" w:hint="default"/>
-      </w:rPr>
-    </w:lvl>
-    <w:lvl w:ilvl="4" w:tplc="D6C01052">
-      <w:start w:val="1"/>
-      <w:numFmt w:val="bullet"/>
-      <w:lvlText w:val="o"/>
-      <w:lvlJc w:val="left"/>
-      <w:pPr>
-        <w:ind w:left="3600" w:hanging="360"/>
-      </w:pPr>
-      <w:rPr>
-        <w:rFonts w:ascii="Courier New" w:hAnsi="Courier New" w:hint="default"/>
-      </w:rPr>
-    </w:lvl>
-    <w:lvl w:ilvl="5" w:tplc="65D4CD00">
-      <w:start w:val="1"/>
-      <w:numFmt w:val="bullet"/>
-      <w:lvlText w:val=""/>
-      <w:lvlJc w:val="left"/>
-      <w:pPr>
-        <w:ind w:left="4320" w:hanging="360"/>
-      </w:pPr>
-      <w:rPr>
-        <w:rFonts w:ascii="Wingdings" w:hAnsi="Wingdings" w:hint="default"/>
-      </w:rPr>
-    </w:lvl>
-    <w:lvl w:ilvl="6" w:tplc="3784424E">
-      <w:start w:val="1"/>
-      <w:numFmt w:val="bullet"/>
-      <w:lvlText w:val=""/>
-      <w:lvlJc w:val="left"/>
-      <w:pPr>
-        <w:ind w:left="5040" w:hanging="360"/>
-      </w:pPr>
-      <w:rPr>
-        <w:rFonts w:ascii="Symbol" w:hAnsi="Symbol" w:hint="default"/>
-      </w:rPr>
-    </w:lvl>
-    <w:lvl w:ilvl="7" w:tplc="0F4C3332">
-      <w:start w:val="1"/>
-      <w:numFmt w:val="bullet"/>
-      <w:lvlText w:val="o"/>
-      <w:lvlJc w:val="left"/>
-      <w:pPr>
-        <w:ind w:left="5760" w:hanging="360"/>
-      </w:pPr>
-      <w:rPr>
-        <w:rFonts w:ascii="Courier New" w:hAnsi="Courier New" w:hint="default"/>
-      </w:rPr>
-    </w:lvl>
-    <w:lvl w:ilvl="8" w:tplc="4CB2AC3C">
-      <w:start w:val="1"/>
-      <w:numFmt w:val="bullet"/>
-      <w:lvlText w:val=""/>
-      <w:lvlJc w:val="left"/>
-      <w:pPr>
-        <w:ind w:left="6480" w:hanging="360"/>
-      </w:pPr>
-      <w:rPr>
-        <w:rFonts w:ascii="Wingdings" w:hAnsi="Wingdings" w:hint="default"/>
-      </w:rPr>
-    </w:lvl>
-  </w:abstractNum>
-  <w:abstractNum w:abstractNumId="16" w15:restartNumberingAfterBreak="0">
-    <w:nsid w:val="54D2DAA6"/>
-    <w:multiLevelType w:val="hybridMultilevel"/>
-    <w:tmpl w:val="3ED28E86"/>
-    <w:lvl w:ilvl="0" w:tplc="3A7026E2">
-      <w:start w:val="1"/>
-      <w:numFmt w:val="decimal"/>
-      <w:lvlText w:val="%1."/>
-      <w:lvlJc w:val="left"/>
-      <w:pPr>
-        <w:ind w:left="720" w:hanging="360"/>
-      </w:pPr>
-    </w:lvl>
-    <w:lvl w:ilvl="1" w:tplc="19540896">
-      <w:start w:val="1"/>
-      <w:numFmt w:val="lowerLetter"/>
-      <w:lvlText w:val="%2."/>
-      <w:lvlJc w:val="left"/>
-      <w:pPr>
-        <w:ind w:left="1440" w:hanging="360"/>
-      </w:pPr>
-    </w:lvl>
-    <w:lvl w:ilvl="2" w:tplc="E466D130">
-      <w:start w:val="1"/>
-      <w:numFmt w:val="lowerRoman"/>
-      <w:lvlText w:val="%3."/>
-      <w:lvlJc w:val="right"/>
-      <w:pPr>
-        <w:ind w:left="2160" w:hanging="180"/>
-      </w:pPr>
-    </w:lvl>
-    <w:lvl w:ilvl="3" w:tplc="A6A20540">
-      <w:start w:val="1"/>
-      <w:numFmt w:val="decimal"/>
-      <w:lvlText w:val="%4."/>
-      <w:lvlJc w:val="left"/>
-      <w:pPr>
-        <w:ind w:left="2880" w:hanging="360"/>
-      </w:pPr>
-    </w:lvl>
-    <w:lvl w:ilvl="4" w:tplc="DB26FC9E">
-      <w:start w:val="1"/>
-      <w:numFmt w:val="lowerLetter"/>
-      <w:lvlText w:val="%5."/>
-      <w:lvlJc w:val="left"/>
-      <w:pPr>
-        <w:ind w:left="3600" w:hanging="360"/>
-      </w:pPr>
-    </w:lvl>
-    <w:lvl w:ilvl="5" w:tplc="01FA39B8">
-      <w:start w:val="1"/>
-      <w:numFmt w:val="lowerRoman"/>
-      <w:lvlText w:val="%6."/>
-      <w:lvlJc w:val="right"/>
-      <w:pPr>
-        <w:ind w:left="4320" w:hanging="180"/>
-      </w:pPr>
-    </w:lvl>
-    <w:lvl w:ilvl="6" w:tplc="D2766E0C">
-      <w:start w:val="1"/>
-      <w:numFmt w:val="decimal"/>
-      <w:lvlText w:val="%7."/>
-      <w:lvlJc w:val="left"/>
-      <w:pPr>
-        <w:ind w:left="5040" w:hanging="360"/>
-      </w:pPr>
-    </w:lvl>
-    <w:lvl w:ilvl="7" w:tplc="35902766">
-      <w:start w:val="1"/>
-      <w:numFmt w:val="lowerLetter"/>
-      <w:lvlText w:val="%8."/>
-      <w:lvlJc w:val="left"/>
-      <w:pPr>
-        <w:ind w:left="5760" w:hanging="360"/>
-      </w:pPr>
-    </w:lvl>
-    <w:lvl w:ilvl="8" w:tplc="D818D1FE">
-      <w:start w:val="1"/>
-      <w:numFmt w:val="lowerRoman"/>
-      <w:lvlText w:val="%9."/>
-      <w:lvlJc w:val="right"/>
-      <w:pPr>
-        <w:ind w:left="6480" w:hanging="180"/>
-      </w:pPr>
-    </w:lvl>
-  </w:abstractNum>
-  <w:abstractNum w:abstractNumId="17" w15:restartNumberingAfterBreak="0">
-    <w:nsid w:val="6053C5C3"/>
-    <w:multiLevelType w:val="hybridMultilevel"/>
-    <w:tmpl w:val="863888AC"/>
-    <w:lvl w:ilvl="0" w:tplc="B2387AD4">
-      <w:start w:val="1"/>
-      <w:numFmt w:val="bullet"/>
-      <w:lvlText w:val=""/>
-      <w:lvlJc w:val="left"/>
-      <w:pPr>
-        <w:ind w:left="720" w:hanging="360"/>
-      </w:pPr>
-      <w:rPr>
-        <w:rFonts w:ascii="Symbol" w:hAnsi="Symbol" w:hint="default"/>
-      </w:rPr>
-    </w:lvl>
-    <w:lvl w:ilvl="1" w:tplc="9D9611C2">
-      <w:start w:val="1"/>
-      <w:numFmt w:val="bullet"/>
-      <w:lvlText w:val="o"/>
-      <w:lvlJc w:val="left"/>
-      <w:pPr>
-        <w:ind w:left="1440" w:hanging="360"/>
-      </w:pPr>
-      <w:rPr>
-        <w:rFonts w:ascii="Courier New" w:hAnsi="Courier New" w:hint="default"/>
-      </w:rPr>
-    </w:lvl>
-    <w:lvl w:ilvl="2" w:tplc="9C26C4D8">
-      <w:start w:val="1"/>
-      <w:numFmt w:val="bullet"/>
-      <w:lvlText w:val=""/>
-      <w:lvlJc w:val="left"/>
-      <w:pPr>
-        <w:ind w:left="2160" w:hanging="360"/>
-      </w:pPr>
-      <w:rPr>
-        <w:rFonts w:ascii="Wingdings" w:hAnsi="Wingdings" w:hint="default"/>
-      </w:rPr>
-    </w:lvl>
-    <w:lvl w:ilvl="3" w:tplc="470031BE">
-      <w:start w:val="1"/>
-      <w:numFmt w:val="bullet"/>
-      <w:lvlText w:val=""/>
-      <w:lvlJc w:val="left"/>
-      <w:pPr>
-        <w:ind w:left="2880" w:hanging="360"/>
-      </w:pPr>
-      <w:rPr>
-        <w:rFonts w:ascii="Symbol" w:hAnsi="Symbol" w:hint="default"/>
-      </w:rPr>
-    </w:lvl>
-    <w:lvl w:ilvl="4" w:tplc="BE346CFC">
-      <w:start w:val="1"/>
-      <w:numFmt w:val="bullet"/>
-      <w:lvlText w:val="o"/>
-      <w:lvlJc w:val="left"/>
-      <w:pPr>
-        <w:ind w:left="3600" w:hanging="360"/>
-      </w:pPr>
-      <w:rPr>
-        <w:rFonts w:ascii="Courier New" w:hAnsi="Courier New" w:hint="default"/>
-      </w:rPr>
-    </w:lvl>
-    <w:lvl w:ilvl="5" w:tplc="6D467252">
-      <w:start w:val="1"/>
-      <w:numFmt w:val="bullet"/>
-      <w:lvlText w:val=""/>
-      <w:lvlJc w:val="left"/>
-      <w:pPr>
-        <w:ind w:left="4320" w:hanging="360"/>
-      </w:pPr>
-      <w:rPr>
-        <w:rFonts w:ascii="Wingdings" w:hAnsi="Wingdings" w:hint="default"/>
-      </w:rPr>
-    </w:lvl>
-    <w:lvl w:ilvl="6" w:tplc="4DB44D2C">
-      <w:start w:val="1"/>
-      <w:numFmt w:val="bullet"/>
-      <w:lvlText w:val=""/>
-      <w:lvlJc w:val="left"/>
-      <w:pPr>
-        <w:ind w:left="5040" w:hanging="360"/>
-      </w:pPr>
-      <w:rPr>
-        <w:rFonts w:ascii="Symbol" w:hAnsi="Symbol" w:hint="default"/>
-      </w:rPr>
-    </w:lvl>
-    <w:lvl w:ilvl="7" w:tplc="080858FA">
-      <w:start w:val="1"/>
-      <w:numFmt w:val="bullet"/>
-      <w:lvlText w:val="o"/>
-      <w:lvlJc w:val="left"/>
-      <w:pPr>
-        <w:ind w:left="5760" w:hanging="360"/>
-      </w:pPr>
-      <w:rPr>
-        <w:rFonts w:ascii="Courier New" w:hAnsi="Courier New" w:hint="default"/>
-      </w:rPr>
-    </w:lvl>
-    <w:lvl w:ilvl="8" w:tplc="C07E5C64">
-      <w:start w:val="1"/>
-      <w:numFmt w:val="bullet"/>
-      <w:lvlText w:val=""/>
-      <w:lvlJc w:val="left"/>
-      <w:pPr>
-        <w:ind w:left="6480" w:hanging="360"/>
-      </w:pPr>
-      <w:rPr>
-        <w:rFonts w:ascii="Wingdings" w:hAnsi="Wingdings" w:hint="default"/>
-      </w:rPr>
-    </w:lvl>
-  </w:abstractNum>
-  <w:abstractNum w:abstractNumId="18" w15:restartNumberingAfterBreak="0">
-    <w:nsid w:val="6BAFEEE6"/>
-    <w:multiLevelType w:val="hybridMultilevel"/>
-    <w:tmpl w:val="77FEB02E"/>
-    <w:lvl w:ilvl="0" w:tplc="6F5EE546">
-      <w:start w:val="1"/>
-      <w:numFmt w:val="bullet"/>
-      <w:lvlText w:val=""/>
-      <w:lvlJc w:val="left"/>
-      <w:pPr>
-        <w:ind w:left="720" w:hanging="360"/>
-      </w:pPr>
-      <w:rPr>
-        <w:rFonts w:ascii="Symbol" w:hAnsi="Symbol" w:hint="default"/>
-      </w:rPr>
-    </w:lvl>
-    <w:lvl w:ilvl="1" w:tplc="4E28CEF6">
-      <w:start w:val="1"/>
-      <w:numFmt w:val="bullet"/>
-      <w:lvlText w:val="o"/>
-      <w:lvlJc w:val="left"/>
-      <w:pPr>
-        <w:ind w:left="1440" w:hanging="360"/>
-      </w:pPr>
-      <w:rPr>
-        <w:rFonts w:ascii="Courier New" w:hAnsi="Courier New" w:hint="default"/>
-      </w:rPr>
-    </w:lvl>
-    <w:lvl w:ilvl="2" w:tplc="35BA974A">
-      <w:start w:val="1"/>
-      <w:numFmt w:val="bullet"/>
-      <w:lvlText w:val=""/>
-      <w:lvlJc w:val="left"/>
-      <w:pPr>
-        <w:ind w:left="2160" w:hanging="360"/>
-      </w:pPr>
-      <w:rPr>
-        <w:rFonts w:ascii="Wingdings" w:hAnsi="Wingdings" w:hint="default"/>
-      </w:rPr>
-    </w:lvl>
-    <w:lvl w:ilvl="3" w:tplc="68BA134E">
-      <w:start w:val="1"/>
-      <w:numFmt w:val="bullet"/>
-      <w:lvlText w:val=""/>
-      <w:lvlJc w:val="left"/>
-      <w:pPr>
-        <w:ind w:left="2880" w:hanging="360"/>
-      </w:pPr>
-      <w:rPr>
-        <w:rFonts w:ascii="Symbol" w:hAnsi="Symbol" w:hint="default"/>
-      </w:rPr>
-    </w:lvl>
-    <w:lvl w:ilvl="4" w:tplc="16F0781E">
-      <w:start w:val="1"/>
-      <w:numFmt w:val="bullet"/>
-      <w:lvlText w:val="o"/>
-      <w:lvlJc w:val="left"/>
-      <w:pPr>
-        <w:ind w:left="3600" w:hanging="360"/>
-      </w:pPr>
-      <w:rPr>
-        <w:rFonts w:ascii="Courier New" w:hAnsi="Courier New" w:hint="default"/>
-      </w:rPr>
-    </w:lvl>
-    <w:lvl w:ilvl="5" w:tplc="B4387968">
-      <w:start w:val="1"/>
-      <w:numFmt w:val="bullet"/>
-      <w:lvlText w:val=""/>
-      <w:lvlJc w:val="left"/>
-      <w:pPr>
-        <w:ind w:left="4320" w:hanging="360"/>
-      </w:pPr>
-      <w:rPr>
-        <w:rFonts w:ascii="Wingdings" w:hAnsi="Wingdings" w:hint="default"/>
-      </w:rPr>
-    </w:lvl>
-    <w:lvl w:ilvl="6" w:tplc="2A1CC1B4">
-      <w:start w:val="1"/>
-      <w:numFmt w:val="bullet"/>
-      <w:lvlText w:val=""/>
-      <w:lvlJc w:val="left"/>
-      <w:pPr>
-        <w:ind w:left="5040" w:hanging="360"/>
-      </w:pPr>
-      <w:rPr>
-        <w:rFonts w:ascii="Symbol" w:hAnsi="Symbol" w:hint="default"/>
-      </w:rPr>
-    </w:lvl>
-    <w:lvl w:ilvl="7" w:tplc="8850FB9A">
-      <w:start w:val="1"/>
-      <w:numFmt w:val="bullet"/>
-      <w:lvlText w:val="o"/>
-      <w:lvlJc w:val="left"/>
-      <w:pPr>
-        <w:ind w:left="5760" w:hanging="360"/>
-      </w:pPr>
-      <w:rPr>
-        <w:rFonts w:ascii="Courier New" w:hAnsi="Courier New" w:hint="default"/>
-      </w:rPr>
-    </w:lvl>
-    <w:lvl w:ilvl="8" w:tplc="E250C4BA">
-      <w:start w:val="1"/>
-      <w:numFmt w:val="bullet"/>
-      <w:lvlText w:val=""/>
-      <w:lvlJc w:val="left"/>
-      <w:pPr>
-        <w:ind w:left="6480" w:hanging="360"/>
-      </w:pPr>
-      <w:rPr>
-        <w:rFonts w:ascii="Wingdings" w:hAnsi="Wingdings" w:hint="default"/>
-      </w:rPr>
-    </w:lvl>
-  </w:abstractNum>
-  <w:num w:numId="1" w16cid:durableId="692926329">
-    <w:abstractNumId w:val="14"/>
-  </w:num>
-  <w:num w:numId="2" w16cid:durableId="518545854">
-    <w:abstractNumId w:val="10"/>
-  </w:num>
-  <w:num w:numId="3" w16cid:durableId="506747127">
-    <w:abstractNumId w:val="12"/>
-  </w:num>
-  <w:num w:numId="4" w16cid:durableId="1395474055">
-    <w:abstractNumId w:val="15"/>
-  </w:num>
-  <w:num w:numId="5" w16cid:durableId="853300850">
-    <w:abstractNumId w:val="9"/>
-  </w:num>
-  <w:num w:numId="6" w16cid:durableId="608315956">
-    <w:abstractNumId w:val="17"/>
-  </w:num>
-  <w:num w:numId="7" w16cid:durableId="1367176973">
-    <w:abstractNumId w:val="16"/>
-  </w:num>
-  <w:num w:numId="8" w16cid:durableId="1601257121">
-    <w:abstractNumId w:val="13"/>
-  </w:num>
-  <w:num w:numId="9" w16cid:durableId="1859850537">
-    <w:abstractNumId w:val="11"/>
-  </w:num>
-  <w:num w:numId="10" w16cid:durableId="1198397634">
-    <w:abstractNumId w:val="18"/>
-  </w:num>
-  <w:num w:numId="11" w16cid:durableId="755630711">
+  <w:num w:numId="1" w16cid:durableId="1043558869">
     <w:abstractNumId w:val="8"/>
   </w:num>
-  <w:num w:numId="12" w16cid:durableId="297957092">
+  <w:num w:numId="2" w16cid:durableId="1509830286">
     <w:abstractNumId w:val="6"/>
   </w:num>
-  <w:num w:numId="13" w16cid:durableId="1685664570">
+  <w:num w:numId="3" w16cid:durableId="1836609763">
     <w:abstractNumId w:val="5"/>
   </w:num>
-  <w:num w:numId="14" w16cid:durableId="1603612396">
+  <w:num w:numId="4" w16cid:durableId="450563008">
     <w:abstractNumId w:val="4"/>
   </w:num>
-  <w:num w:numId="15" w16cid:durableId="1986816089">
+  <w:num w:numId="5" w16cid:durableId="1692754959">
     <w:abstractNumId w:val="7"/>
   </w:num>
-  <w:num w:numId="16" w16cid:durableId="902718761">
+  <w:num w:numId="6" w16cid:durableId="1995374634">
     <w:abstractNumId w:val="3"/>
   </w:num>
-  <w:num w:numId="17" w16cid:durableId="533426010">
+  <w:num w:numId="7" w16cid:durableId="582495422">
     <w:abstractNumId w:val="2"/>
   </w:num>
-  <w:num w:numId="18" w16cid:durableId="380325943">
+  <w:num w:numId="8" w16cid:durableId="1174102216">
     <w:abstractNumId w:val="1"/>
   </w:num>
-  <w:num w:numId="19" w16cid:durableId="1904556433">
+  <w:num w:numId="9" w16cid:durableId="1205869989">
     <w:abstractNumId w:val="0"/>
   </w:num>
 </w:numbering>
@@ -2813,6 +1918,10 @@
     <w:name w:val="Normal"/>
     <w:qFormat/>
     <w:rsid w:val="00FC693F"/>
+    <w:rPr>
+      <w:rFonts w:ascii="Times New Roman" w:eastAsia="Times New Roman" w:hAnsi="Times New Roman"/>
+      <w:sz w:val="18"/>
+    </w:rPr>
   </w:style>
   <w:style w:type="paragraph" w:styleId="Heading1">
     <w:name w:val="heading 1"/>
@@ -3338,7 +2447,7 @@
     <w:rsid w:val="00326F90"/>
     <w:pPr>
       <w:numPr>
-        <w:numId w:val="11"/>
+        <w:numId w:val="1"/>
       </w:numPr>
       <w:contextualSpacing/>
     </w:pPr>
@@ -3351,7 +2460,7 @@
     <w:rsid w:val="00326F90"/>
     <w:pPr>
       <w:numPr>
-        <w:numId w:val="12"/>
+        <w:numId w:val="2"/>
       </w:numPr>
       <w:contextualSpacing/>
     </w:pPr>
@@ -3364,7 +2473,7 @@
     <w:rsid w:val="00326F90"/>
     <w:pPr>
       <w:numPr>
-        <w:numId w:val="13"/>
+        <w:numId w:val="3"/>
       </w:numPr>
       <w:contextualSpacing/>
     </w:pPr>
@@ -3377,7 +2486,7 @@
     <w:rsid w:val="00326F90"/>
     <w:pPr>
       <w:numPr>
-        <w:numId w:val="15"/>
+        <w:numId w:val="5"/>
       </w:numPr>
       <w:contextualSpacing/>
     </w:pPr>
@@ -3390,7 +2499,7 @@
     <w:rsid w:val="0029639D"/>
     <w:pPr>
       <w:numPr>
-        <w:numId w:val="16"/>
+        <w:numId w:val="6"/>
       </w:numPr>
       <w:contextualSpacing/>
     </w:pPr>
@@ -3403,7 +2512,7 @@
     <w:rsid w:val="0029639D"/>
     <w:pPr>
       <w:numPr>
-        <w:numId w:val="17"/>
+        <w:numId w:val="7"/>
       </w:numPr>
       <w:contextualSpacing/>
     </w:pPr>
@@ -3607,7 +2716,6 @@
       <w:b/>
       <w:bCs/>
       <w:color w:val="4F81BD" w:themeColor="accent1"/>
-      <w:sz w:val="18"/>
       <w:szCs w:val="18"/>
     </w:rPr>
   </w:style>
@@ -13803,15 +12911,35 @@
       </w:tcPr>
     </w:tblStylePr>
   </w:style>
+  <w:style w:type="paragraph" w:customStyle="1" w:styleId="ResumeBullet">
+    <w:name w:val="Resume Bullet"/>
+    <w:basedOn w:val="Normal"/>
+    <w:pPr>
+      <w:spacing w:after="0" w:line="240" w:lineRule="auto"/>
+      <w:ind w:left="259" w:hanging="173"/>
+    </w:pPr>
+  </w:style>
   <w:style w:type="character" w:styleId="Hyperlink">
     <w:name w:val="Hyperlink"/>
     <w:basedOn w:val="DefaultParagraphFont"/>
     <w:uiPriority w:val="99"/>
     <w:unhideWhenUsed/>
-    <w:rsid w:val="031682E4"/>
+    <w:rsid w:val="008361B8"/>
     <w:rPr>
-      <w:color w:val="0000FF"/>
+      <w:color w:val="0000FF" w:themeColor="hyperlink"/>
       <w:u w:val="single"/>
+    </w:rPr>
+  </w:style>
+  <w:style w:type="character" w:styleId="UnresolvedMention">
+    <w:name w:val="Unresolved Mention"/>
+    <w:basedOn w:val="DefaultParagraphFont"/>
+    <w:uiPriority w:val="99"/>
+    <w:semiHidden/>
+    <w:unhideWhenUsed/>
+    <w:rsid w:val="008361B8"/>
+    <w:rPr>
+      <w:color w:val="605E5C"/>
+      <w:shd w:val="clear" w:color="auto" w:fill="E1DFDD"/>
     </w:rPr>
   </w:style>
 </w:styles>

</xml_diff>